<commit_message>
Word : méthode (vagues et quota), signaux du développeur augmenté calculés depuis l'échantillon
Co-Authored-By: Claude Fable 5.1 <noreply@anthropic.com>
Claude-Session: https://claude.ai/code/session_01XMur3EjWoJPqS7QuAJkjnZ
</commit_message>
<xml_diff>
--- a/NEXA_Synthese_Marche_Emploi_Developpement_Web_2026.docx
+++ b/NEXA_Synthese_Marche_Emploi_Developpement_Web_2026.docx
@@ -86,7 +86,7 @@
         <w:pStyle w:val="ListBullet"/>
       </w:pPr>
       <w:r>
-        <w:t>Contrainte technique majeure : aucun accès direct aux sites (proxy réseau), ni à l'API France Travail ; toutes les offres et tous les comptes d'offres proviennent des pages publiques indexées par un moteur de recherche (titres, URL, extraits). De nombreux champs (expérience, salaire, télétravail) ne figurent pas dans les extraits et sont notés NC ; les parts calculées portent uniquement sur les offres renseignées, avec l'effectif indiqué. Voir le fichier Markdown pour le journal complet.</w:t>
+        <w:t>Contrainte technique majeure : aucun accès direct aux sites (proxy réseau), ni à l'API France Travail ; toutes les offres et tous les comptes d'offres proviennent des pages publiques indexées par un moteur de recherche (titres, URL, extraits), avec un plafond de 200 requêtes par session de collecte, d'où une collecte en plusieurs vagues (A à E) et plusieurs sessions parallèles, chacune journalisée. De nombreux champs (expérience, salaire, télétravail) ne figurent pas dans les extraits et sont notés NC ; les parts calculées portent uniquement sur les offres renseignées, avec l'effectif indiqué. Les fourchettes d'expérience du type « 1 à 7 ans » sont classées d'après leur borne basse. Voir le fichier Markdown pour le journal complet.</w:t>
       </w:r>
     </w:p>
     <w:p>
@@ -13181,7 +13181,7 @@
           <w:b w:val="0"/>
           <w:i w:val="0"/>
         </w:rPr>
-        <w:t>Le terme « développeur augmenté » n'apparaît dans aucune offre collectée. En revanche trois signaux observables existent : (1) des offres de développeur web/full stack qui exigent la maîtrise d'assistants de code (Copilot, Cursor, Claude, ChatGPT) : 43 dans l'échantillon (2.9 % des offres cœur de marché), par exemple Groupe M6 AdTech à Lille, Figaro Classifieds et une mission PHP/Symfony à Paris, un poste Java à Tours, un stage Sopra Steria à Nantes ; (2) une famille de métiers émergents (AI Engineer, AI Software Engineer, LLM/GenAI Engineer, développeur RAG/agents) qui représente 179 offres uniques, presque toutes à Paris et pour des profils expérimentés ; (3) le chiffre Indeed de 21 % d'annonces de développement logiciel mentionnant l'IA, qui inclut aussi bien l'usage d'outils que le développement de fonctionnalités IA.</w:t>
+        <w:t>Le terme « développeur augmenté » n'apparaît dans aucune offre collectée. En revanche trois signaux observables existent : (1) des offres de développeur web/full stack/logiciel « classiques » qui citent l'IA : 43 dans l'échantillon (2.9 % des offres cœur de marché et évolutions), dont 9 exigent ou mentionnent explicitement un assistant de code (Copilot, Cursor, Claude Code, ChatGPT, Codex, développement assisté par IA), par exemple Koala Interactive (Levallois-Perret : Cursor ; Claude Code) ; Groupe M6 (Neuilly-sur-Seine : GitHub Copilot ; Cursor ; ChatGPT) ; Theodo FinTech (Paris : GitHub Copilot ; Cursor) ; Bump (ville NC : GitHub Copilot ; Cursor) ; Figaro Classifieds (Paris : GitHub Copilot ; Cursor ; Claude Code) ; LinkedIn (ville NC : GitHub Copilot) ; Société Générale (France : GitHub Copilot) ; Sopra Steria (Nantes : GitHub Copilot) ; (2) une famille de métiers émergents (AI Engineer, AI Software Engineer, LLM/GenAI Engineer, développeur RAG/agents) qui représente 179 offres uniques, presque toutes à Paris et pour des profils expérimentés ; (3) le chiffre Indeed de 21 % d'annonces de développement logiciel mentionnant l'IA, qui inclut aussi bien l'usage d'outils que le développement de fonctionnalités IA.</w:t>
       </w:r>
     </w:p>
     <w:p>

</xml_diff>

<commit_message>
Intègre les collectes E2 et E4 : 3 465 lignes brutes, 2 972 offres uniques, 1 259 séries de stocks
- E2 (HelloWork) : 315 offres, 342 comptes datés ; E4 (WTTJ, LinkedIn, Free-Work, cabinets) : 468 offres, 122 comptes
- Contrat renseigné pour 1 717 offres, séniorité pour 1 287, salaire annuel pour 282
- Règles de classement complétées (AI consultant, LLMOps, test et recette, BTS SIO, informaticien d'application)
- README et dates des livrables mis à jour
- Contrôles de cohérence : offres détaillées, sommes métiers/régions/villes, contrats, séniorité, URL, doublons, traçabilité des estimations

Co-Authored-By: Claude Opus 5 <noreply@anthropic.com>
Claude-Session: https://claude.ai/code/session_01XMur3EjWoJPqS7QuAJkjnZ
</commit_message>
<xml_diff>
--- a/NEXA_Synthese_Marche_Emploi_Developpement_Web_2026.docx
+++ b/NEXA_Synthese_Marche_Emploi_Developpement_Web_2026.docx
@@ -36,7 +36,7 @@
         <w:rPr>
           <w:i/>
         </w:rPr>
-        <w:t>Collecte et analyse arrêtées au 6 septembre 2026 — livrables associés : NEXA_Marche_Emploi_Developpement_Web_France_2026.xlsx (5 onglets) et NEXA_Perimetre_Metiers_et_Plateformes_Sans_Donnees.md (journal de collecte)</w:t>
+        <w:t>Collecte des offres et des études arrêtée au 6 septembre 2026, analyse finalisée le 9 septembre 2026 — livrables associés : NEXA_Marche_Emploi_Developpement_Web_France_2026.xlsx (5 onglets) et NEXA_Perimetre_Metiers_et_Plateformes_Sans_Donnees.md (journal de collecte)</w:t>
       </w:r>
     </w:p>
     <w:p>
@@ -78,7 +78,7 @@
         <w:pStyle w:val="ListBullet"/>
       </w:pPr>
       <w:r>
-        <w:t>Échantillon collecté : 3121 lignes d'offres brutes sur 17 plateformes (Indeed, Welcome to the Jungle, France Travail, HelloWork, Apec, LinkedIn, Free-Work, Talent.com, sites carrières), 2662 offres uniques après dédoublonnage, 2645 dans le périmètre étudié (Excel, onglet OFFRES_DETAILLEES). Taux de doublons multi-plateformes ou probables : 4.0 % ; republications : 7.1 %.</w:t>
+        <w:t>Échantillon collecté : 3465 lignes d'offres brutes sur 17 plateformes (Indeed, Welcome to the Jungle, France Travail, HelloWork, Apec, LinkedIn, Free-Work, Talent.com, sites carrières), 2972 offres uniques après dédoublonnage, 2953 dans le périmètre étudié (Excel, onglet OFFRES_DETAILLEES). Taux de doublons multi-plateformes ou probables : 4.1 % ; republications : 6.6 %.</w:t>
       </w:r>
     </w:p>
     <w:p>
@@ -1644,7 +1644,7 @@
           <w:b w:val="0"/>
           <w:i w:val="0"/>
         </w:rPr>
-        <w:t>Dans l'échantillon d'offres uniques (2645), le cœur de marché représente 67.9 % des offres, les évolutions naturelles 10.2 %, les spécialisations 9.6 % et les métiers émergents liés à l'IA 9.6 % (ces derniers ont été recherchés spécifiquement et sont donc surreprésentés). Excel, onglet SYNTHESE_METIERS, table T_SYNTHESE_METIERS.</w:t>
+        <w:t>Dans l'échantillon d'offres uniques (2953), le cœur de marché représente 68.4 % des offres, les évolutions naturelles 10.1 %, les spécialisations 9.1 % et les métiers émergents liés à l'IA 9.8 % (ces derniers ont été recherchés spécifiquement et sont donc surreprésentés). Excel, onglet SYNTHESE_METIERS, table T_SYNTHESE_METIERS.</w:t>
       </w:r>
     </w:p>
     <w:tbl>
@@ -1754,7 +1754,7 @@
               <w:rPr>
                 <w:sz w:val="16"/>
               </w:rPr>
-              <w:t>648</w:t>
+              <w:t>759</w:t>
             </w:r>
           </w:p>
         </w:tc>
@@ -1768,7 +1768,7 @@
               <w:rPr>
                 <w:sz w:val="16"/>
               </w:rPr>
-              <w:t>24.5 %</w:t>
+              <w:t>25.7 %</w:t>
             </w:r>
           </w:p>
         </w:tc>
@@ -1812,7 +1812,7 @@
               <w:rPr>
                 <w:sz w:val="16"/>
               </w:rPr>
-              <w:t>168</w:t>
+              <w:t>186</w:t>
             </w:r>
           </w:p>
         </w:tc>
@@ -1826,7 +1826,7 @@
               <w:rPr>
                 <w:sz w:val="16"/>
               </w:rPr>
-              <w:t>6.4 %</w:t>
+              <w:t>6.3 %</w:t>
             </w:r>
           </w:p>
         </w:tc>
@@ -1870,7 +1870,7 @@
               <w:rPr>
                 <w:sz w:val="16"/>
               </w:rPr>
-              <w:t>154</w:t>
+              <w:t>160</w:t>
             </w:r>
           </w:p>
         </w:tc>
@@ -1884,7 +1884,7 @@
               <w:rPr>
                 <w:sz w:val="16"/>
               </w:rPr>
-              <w:t>5.8 %</w:t>
+              <w:t>5.4 %</w:t>
             </w:r>
           </w:p>
         </w:tc>
@@ -1928,7 +1928,7 @@
               <w:rPr>
                 <w:sz w:val="16"/>
               </w:rPr>
-              <w:t>140</w:t>
+              <w:t>155</w:t>
             </w:r>
           </w:p>
         </w:tc>
@@ -1942,7 +1942,7 @@
               <w:rPr>
                 <w:sz w:val="16"/>
               </w:rPr>
-              <w:t>5.3 %</w:t>
+              <w:t>5.2 %</w:t>
             </w:r>
           </w:p>
         </w:tc>
@@ -1986,7 +1986,7 @@
               <w:rPr>
                 <w:sz w:val="16"/>
               </w:rPr>
-              <w:t>128</w:t>
+              <w:t>153</w:t>
             </w:r>
           </w:p>
         </w:tc>
@@ -2000,7 +2000,7 @@
               <w:rPr>
                 <w:sz w:val="16"/>
               </w:rPr>
-              <w:t>4.8 %</w:t>
+              <w:t>5.2 %</w:t>
             </w:r>
           </w:p>
         </w:tc>
@@ -2044,7 +2044,7 @@
               <w:rPr>
                 <w:sz w:val="16"/>
               </w:rPr>
-              <w:t>124</w:t>
+              <w:t>141</w:t>
             </w:r>
           </w:p>
         </w:tc>
@@ -2058,7 +2058,7 @@
               <w:rPr>
                 <w:sz w:val="16"/>
               </w:rPr>
-              <w:t>4.7 %</w:t>
+              <w:t>4.8 %</w:t>
             </w:r>
           </w:p>
         </w:tc>
@@ -2102,7 +2102,7 @@
               <w:rPr>
                 <w:sz w:val="16"/>
               </w:rPr>
-              <w:t>112</w:t>
+              <w:t>125</w:t>
             </w:r>
           </w:p>
         </w:tc>
@@ -2160,7 +2160,7 @@
               <w:rPr>
                 <w:sz w:val="16"/>
               </w:rPr>
-              <w:t>111</w:t>
+              <w:t>123</w:t>
             </w:r>
           </w:p>
         </w:tc>
@@ -2218,7 +2218,7 @@
               <w:rPr>
                 <w:sz w:val="16"/>
               </w:rPr>
-              <w:t>108</w:t>
+              <w:t>115</w:t>
             </w:r>
           </w:p>
         </w:tc>
@@ -2232,7 +2232,7 @@
               <w:rPr>
                 <w:sz w:val="16"/>
               </w:rPr>
-              <w:t>4.1 %</w:t>
+              <w:t>3.9 %</w:t>
             </w:r>
           </w:p>
         </w:tc>
@@ -2262,7 +2262,7 @@
               <w:rPr>
                 <w:sz w:val="16"/>
               </w:rPr>
-              <w:t>Développeur mobile</w:t>
+              <w:t>Développeur PHP / Symfony / Laravel</w:t>
             </w:r>
           </w:p>
         </w:tc>
@@ -2276,7 +2276,7 @@
               <w:rPr>
                 <w:sz w:val="16"/>
               </w:rPr>
-              <w:t>98</w:t>
+              <w:t>104</w:t>
             </w:r>
           </w:p>
         </w:tc>
@@ -2290,7 +2290,7 @@
               <w:rPr>
                 <w:sz w:val="16"/>
               </w:rPr>
-              <w:t>3.7 %</w:t>
+              <w:t>3.5 %</w:t>
             </w:r>
           </w:p>
         </w:tc>
@@ -2304,7 +2304,7 @@
               <w:rPr>
                 <w:sz w:val="16"/>
               </w:rPr>
-              <w:t>Débouché adjacent des profils JavaScript (React Native, Flutter).</w:t>
+              <w:t>Écosystème français toujours présent (ESN, agences, médias) mais en recul sur Indeed (« Développeur PHP » plus de 4 000 en juillet 2025, plus de 2 000 en août 2026).</w:t>
             </w:r>
           </w:p>
         </w:tc>
@@ -2320,7 +2320,7 @@
               <w:rPr>
                 <w:sz w:val="16"/>
               </w:rPr>
-              <w:t>Concepteur développeur d'applications / logiciel</w:t>
+              <w:t>Développeur mobile</w:t>
             </w:r>
           </w:p>
         </w:tc>
@@ -2334,7 +2334,7 @@
               <w:rPr>
                 <w:sz w:val="16"/>
               </w:rPr>
-              <w:t>92</w:t>
+              <w:t>102</w:t>
             </w:r>
           </w:p>
         </w:tc>
@@ -2362,7 +2362,7 @@
               <w:rPr>
                 <w:sz w:val="16"/>
               </w:rPr>
-              <w:t>Voir Excel.</w:t>
+              <w:t>Débouché adjacent des profils JavaScript (React Native, Flutter).</w:t>
             </w:r>
           </w:p>
         </w:tc>
@@ -2378,7 +2378,7 @@
               <w:rPr>
                 <w:sz w:val="16"/>
               </w:rPr>
-              <w:t>Développeur PHP / Symfony / Laravel</w:t>
+              <w:t>Concepteur développeur d'applications / logiciel</w:t>
             </w:r>
           </w:p>
         </w:tc>
@@ -2392,7 +2392,7 @@
               <w:rPr>
                 <w:sz w:val="16"/>
               </w:rPr>
-              <w:t>88</w:t>
+              <w:t>98</w:t>
             </w:r>
           </w:p>
         </w:tc>
@@ -2420,7 +2420,7 @@
               <w:rPr>
                 <w:sz w:val="16"/>
               </w:rPr>
-              <w:t>Écosystème français toujours présent (ESN, agences, médias) mais en recul sur Indeed (« Développeur PHP » plus de 4 000 en juillet 2025, plus de 2 000 en août 2026).</w:t>
+              <w:t>Voir Excel.</w:t>
             </w:r>
           </w:p>
         </w:tc>
@@ -2614,7 +2614,7 @@
               <w:rPr>
                 <w:sz w:val="15"/>
               </w:rPr>
-              <w:t>764</w:t>
+              <w:t>875</w:t>
             </w:r>
           </w:p>
         </w:tc>
@@ -2628,7 +2628,7 @@
               <w:rPr>
                 <w:sz w:val="15"/>
               </w:rPr>
-              <w:t>28.9 %</w:t>
+              <w:t>29.6 %</w:t>
             </w:r>
           </w:p>
         </w:tc>
@@ -2642,7 +2642,7 @@
               <w:rPr>
                 <w:sz w:val="15"/>
               </w:rPr>
-              <w:t>11.4</w:t>
+              <w:t>13.6</w:t>
             </w:r>
           </w:p>
         </w:tc>
@@ -2656,7 +2656,7 @@
               <w:rPr>
                 <w:sz w:val="15"/>
               </w:rPr>
-              <w:t>43.8</w:t>
+              <w:t>45.5</w:t>
             </w:r>
           </w:p>
         </w:tc>
@@ -2670,7 +2670,7 @@
               <w:rPr>
                 <w:sz w:val="15"/>
               </w:rPr>
-              <w:t>153</w:t>
+              <w:t>180</w:t>
             </w:r>
           </w:p>
         </w:tc>
@@ -2684,7 +2684,7 @@
               <w:rPr>
                 <w:sz w:val="15"/>
               </w:rPr>
-              <w:t>Développeur full stack (175) ; AI Engineer / Développeur IA (66)</w:t>
+              <w:t>Développeur full stack (219) ; AI Engineer / Développeur IA (79)</w:t>
             </w:r>
           </w:p>
         </w:tc>
@@ -2714,7 +2714,7 @@
               <w:rPr>
                 <w:sz w:val="15"/>
               </w:rPr>
-              <w:t>381</w:t>
+              <w:t>439</w:t>
             </w:r>
           </w:p>
         </w:tc>
@@ -2728,7 +2728,7 @@
               <w:rPr>
                 <w:sz w:val="15"/>
               </w:rPr>
-              <w:t>14.4 %</w:t>
+              <w:t>14.9 %</w:t>
             </w:r>
           </w:p>
         </w:tc>
@@ -2742,7 +2742,7 @@
               <w:rPr>
                 <w:sz w:val="15"/>
               </w:rPr>
-              <w:t>13.6</w:t>
+              <w:t>13.9</w:t>
             </w:r>
           </w:p>
         </w:tc>
@@ -2756,7 +2756,7 @@
               <w:rPr>
                 <w:sz w:val="15"/>
               </w:rPr>
-              <w:t>41.4</w:t>
+              <w:t>41.3</w:t>
             </w:r>
           </w:p>
         </w:tc>
@@ -2770,7 +2770,7 @@
               <w:rPr>
                 <w:sz w:val="15"/>
               </w:rPr>
-              <w:t>21</w:t>
+              <w:t>22</w:t>
             </w:r>
           </w:p>
         </w:tc>
@@ -2784,7 +2784,7 @@
               <w:rPr>
                 <w:sz w:val="15"/>
               </w:rPr>
-              <w:t>Développeur full stack (97) ; Développeur web (intitulé générique) (25)</w:t>
+              <w:t>Développeur full stack (112) ; Développeur (intitulé générique) (30)</w:t>
             </w:r>
           </w:p>
         </w:tc>
@@ -2814,7 +2814,7 @@
               <w:rPr>
                 <w:sz w:val="15"/>
               </w:rPr>
-              <w:t>251</w:t>
+              <w:t>269</w:t>
             </w:r>
           </w:p>
         </w:tc>
@@ -2828,7 +2828,7 @@
               <w:rPr>
                 <w:sz w:val="15"/>
               </w:rPr>
-              <w:t>9.5 %</w:t>
+              <w:t>9.1 %</w:t>
             </w:r>
           </w:p>
         </w:tc>
@@ -2842,7 +2842,7 @@
               <w:rPr>
                 <w:sz w:val="15"/>
               </w:rPr>
-              <w:t>8.8</w:t>
+              <w:t>8.6</w:t>
             </w:r>
           </w:p>
         </w:tc>
@@ -2856,7 +2856,7 @@
               <w:rPr>
                 <w:sz w:val="15"/>
               </w:rPr>
-              <w:t>35.4</w:t>
+              <w:t>33.7</w:t>
             </w:r>
           </w:p>
         </w:tc>
@@ -2870,7 +2870,7 @@
               <w:rPr>
                 <w:sz w:val="15"/>
               </w:rPr>
-              <w:t>24</w:t>
+              <w:t>27</w:t>
             </w:r>
           </w:p>
         </w:tc>
@@ -2884,7 +2884,7 @@
               <w:rPr>
                 <w:sz w:val="15"/>
               </w:rPr>
-              <w:t>Développeur full stack (65) ; Développeur Java / Spring (23)</w:t>
+              <w:t>Développeur full stack (68) ; Développeur Java / Spring (23)</w:t>
             </w:r>
           </w:p>
         </w:tc>
@@ -2914,7 +2914,7 @@
               <w:rPr>
                 <w:sz w:val="15"/>
               </w:rPr>
-              <w:t>217</w:t>
+              <w:t>227</w:t>
             </w:r>
           </w:p>
         </w:tc>
@@ -2928,7 +2928,7 @@
               <w:rPr>
                 <w:sz w:val="15"/>
               </w:rPr>
-              <w:t>8.2 %</w:t>
+              <w:t>7.7 %</w:t>
             </w:r>
           </w:p>
         </w:tc>
@@ -2942,7 +2942,7 @@
               <w:rPr>
                 <w:sz w:val="15"/>
               </w:rPr>
-              <w:t>13.4</w:t>
+              <w:t>12.8</w:t>
             </w:r>
           </w:p>
         </w:tc>
@@ -2956,7 +2956,7 @@
               <w:rPr>
                 <w:sz w:val="15"/>
               </w:rPr>
-              <w:t>43.0</w:t>
+              <w:t>40.7</w:t>
             </w:r>
           </w:p>
         </w:tc>
@@ -2984,7 +2984,7 @@
               <w:rPr>
                 <w:sz w:val="15"/>
               </w:rPr>
-              <w:t>Développeur full stack (53) ; Développeur web (intitulé générique) (15)</w:t>
+              <w:t>Développeur full stack (55) ; Développeur Java / Spring (16)</w:t>
             </w:r>
           </w:p>
         </w:tc>
@@ -3014,7 +3014,7 @@
               <w:rPr>
                 <w:sz w:val="15"/>
               </w:rPr>
-              <w:t>186</w:t>
+              <w:t>202</w:t>
             </w:r>
           </w:p>
         </w:tc>
@@ -3028,7 +3028,7 @@
               <w:rPr>
                 <w:sz w:val="15"/>
               </w:rPr>
-              <w:t>7.0 %</w:t>
+              <w:t>6.8 %</w:t>
             </w:r>
           </w:p>
         </w:tc>
@@ -3042,7 +3042,7 @@
               <w:rPr>
                 <w:sz w:val="15"/>
               </w:rPr>
-              <w:t>14.5</w:t>
+              <w:t>15.3</w:t>
             </w:r>
           </w:p>
         </w:tc>
@@ -3056,7 +3056,7 @@
               <w:rPr>
                 <w:sz w:val="15"/>
               </w:rPr>
-              <w:t>47.3</w:t>
+              <w:t>46.4</w:t>
             </w:r>
           </w:p>
         </w:tc>
@@ -3070,7 +3070,7 @@
               <w:rPr>
                 <w:sz w:val="15"/>
               </w:rPr>
-              <w:t>11</w:t>
+              <w:t>14</w:t>
             </w:r>
           </w:p>
         </w:tc>
@@ -3084,7 +3084,7 @@
               <w:rPr>
                 <w:sz w:val="15"/>
               </w:rPr>
-              <w:t>Développeur full stack (48) ; Développeur (intitulé générique) (13)</w:t>
+              <w:t>Développeur full stack (54) ; Développeur (intitulé générique) (14)</w:t>
             </w:r>
           </w:p>
         </w:tc>
@@ -3114,7 +3114,7 @@
               <w:rPr>
                 <w:sz w:val="15"/>
               </w:rPr>
-              <w:t>181</w:t>
+              <w:t>199</w:t>
             </w:r>
           </w:p>
         </w:tc>
@@ -3128,7 +3128,7 @@
               <w:rPr>
                 <w:sz w:val="15"/>
               </w:rPr>
-              <w:t>6.8 %</w:t>
+              <w:t>6.7 %</w:t>
             </w:r>
           </w:p>
         </w:tc>
@@ -3142,7 +3142,7 @@
               <w:rPr>
                 <w:sz w:val="15"/>
               </w:rPr>
-              <w:t>16.6</w:t>
+              <w:t>15.6</w:t>
             </w:r>
           </w:p>
         </w:tc>
@@ -3156,7 +3156,7 @@
               <w:rPr>
                 <w:sz w:val="15"/>
               </w:rPr>
-              <w:t>54.3</w:t>
+              <w:t>51.6</w:t>
             </w:r>
           </w:p>
         </w:tc>
@@ -3170,7 +3170,7 @@
               <w:rPr>
                 <w:sz w:val="15"/>
               </w:rPr>
-              <w:t>13</w:t>
+              <w:t>14</w:t>
             </w:r>
           </w:p>
         </w:tc>
@@ -3184,7 +3184,7 @@
               <w:rPr>
                 <w:sz w:val="15"/>
               </w:rPr>
-              <w:t>Développeur full stack (39) ; Développeur web (intitulé générique) (21)</w:t>
+              <w:t>Développeur full stack (46) ; Développeur web (intitulé générique) (22)</w:t>
             </w:r>
           </w:p>
         </w:tc>
@@ -3214,7 +3214,7 @@
               <w:rPr>
                 <w:sz w:val="15"/>
               </w:rPr>
-              <w:t>180</w:t>
+              <w:t>196</w:t>
             </w:r>
           </w:p>
         </w:tc>
@@ -3228,7 +3228,7 @@
               <w:rPr>
                 <w:sz w:val="15"/>
               </w:rPr>
-              <w:t>6.8 %</w:t>
+              <w:t>6.6 %</w:t>
             </w:r>
           </w:p>
         </w:tc>
@@ -3242,7 +3242,7 @@
               <w:rPr>
                 <w:sz w:val="15"/>
               </w:rPr>
-              <w:t>13.3</w:t>
+              <w:t>13.8</w:t>
             </w:r>
           </w:p>
         </w:tc>
@@ -3256,7 +3256,7 @@
               <w:rPr>
                 <w:sz w:val="15"/>
               </w:rPr>
-              <w:t>43.6</w:t>
+              <w:t>42.7</w:t>
             </w:r>
           </w:p>
         </w:tc>
@@ -3270,7 +3270,7 @@
               <w:rPr>
                 <w:sz w:val="15"/>
               </w:rPr>
-              <w:t>17</w:t>
+              <w:t>18</w:t>
             </w:r>
           </w:p>
         </w:tc>
@@ -3284,7 +3284,7 @@
               <w:rPr>
                 <w:sz w:val="15"/>
               </w:rPr>
-              <w:t>Développeur full stack (57) ; Développeur Java / Spring (17)</w:t>
+              <w:t>Développeur full stack (65) ; Développeur Java / Spring (20)</w:t>
             </w:r>
           </w:p>
         </w:tc>
@@ -3300,7 +3300,7 @@
               <w:rPr>
                 <w:sz w:val="15"/>
               </w:rPr>
-              <w:t>Grand Est</w:t>
+              <w:t>NC</w:t>
             </w:r>
           </w:p>
         </w:tc>
@@ -3314,7 +3314,7 @@
               <w:rPr>
                 <w:sz w:val="15"/>
               </w:rPr>
-              <w:t>101</w:t>
+              <w:t>111</w:t>
             </w:r>
           </w:p>
         </w:tc>
@@ -3342,7 +3342,7 @@
               <w:rPr>
                 <w:sz w:val="15"/>
               </w:rPr>
-              <w:t>22.8</w:t>
+              <w:t>15.3</w:t>
             </w:r>
           </w:p>
         </w:tc>
@@ -3356,7 +3356,7 @@
               <w:rPr>
                 <w:sz w:val="15"/>
               </w:rPr>
-              <w:t>72.5</w:t>
+              <w:t>40.4</w:t>
             </w:r>
           </w:p>
         </w:tc>
@@ -3370,7 +3370,7 @@
               <w:rPr>
                 <w:sz w:val="15"/>
               </w:rPr>
-              <w:t>5</w:t>
+              <w:t>37</w:t>
             </w:r>
           </w:p>
         </w:tc>
@@ -3384,7 +3384,7 @@
               <w:rPr>
                 <w:sz w:val="15"/>
               </w:rPr>
-              <w:t>Développeur full stack (24) ; Concepteur développeur d'applications / logiciel (14)</w:t>
+              <w:t>Développeur full stack (28) ; AI Engineer / Développeur IA (15)</w:t>
             </w:r>
           </w:p>
         </w:tc>
@@ -3400,7 +3400,7 @@
               <w:rPr>
                 <w:sz w:val="15"/>
               </w:rPr>
-              <w:t>Bretagne</w:t>
+              <w:t>Grand Est</w:t>
             </w:r>
           </w:p>
         </w:tc>
@@ -3414,7 +3414,7 @@
               <w:rPr>
                 <w:sz w:val="15"/>
               </w:rPr>
-              <w:t>88</w:t>
+              <w:t>109</w:t>
             </w:r>
           </w:p>
         </w:tc>
@@ -3428,7 +3428,7 @@
               <w:rPr>
                 <w:sz w:val="15"/>
               </w:rPr>
-              <w:t>3.3 %</w:t>
+              <w:t>3.7 %</w:t>
             </w:r>
           </w:p>
         </w:tc>
@@ -3442,7 +3442,7 @@
               <w:rPr>
                 <w:sz w:val="15"/>
               </w:rPr>
-              <w:t>8.0</w:t>
+              <w:t>22.0</w:t>
             </w:r>
           </w:p>
         </w:tc>
@@ -3456,7 +3456,7 @@
               <w:rPr>
                 <w:sz w:val="15"/>
               </w:rPr>
-              <w:t>42.9</w:t>
+              <w:t>73.8</w:t>
             </w:r>
           </w:p>
         </w:tc>
@@ -3484,7 +3484,7 @@
               <w:rPr>
                 <w:sz w:val="15"/>
               </w:rPr>
-              <w:t>Développeur full stack (20) ; Développeur web (intitulé générique) (8)</w:t>
+              <w:t>Développeur full stack (28) ; Concepteur développeur d'applications / logiciel (14)</w:t>
             </w:r>
           </w:p>
         </w:tc>
@@ -3500,7 +3500,7 @@
               <w:rPr>
                 <w:sz w:val="15"/>
               </w:rPr>
-              <w:t>NC</w:t>
+              <w:t>Bretagne</w:t>
             </w:r>
           </w:p>
         </w:tc>
@@ -3514,7 +3514,7 @@
               <w:rPr>
                 <w:sz w:val="15"/>
               </w:rPr>
-              <w:t>88</w:t>
+              <w:t>99</w:t>
             </w:r>
           </w:p>
         </w:tc>
@@ -3528,7 +3528,7 @@
               <w:rPr>
                 <w:sz w:val="15"/>
               </w:rPr>
-              <w:t>3.3 %</w:t>
+              <w:t>3.4 %</w:t>
             </w:r>
           </w:p>
         </w:tc>
@@ -3542,7 +3542,7 @@
               <w:rPr>
                 <w:sz w:val="15"/>
               </w:rPr>
-              <w:t>15.9</w:t>
+              <w:t>9.1</w:t>
             </w:r>
           </w:p>
         </w:tc>
@@ -3556,7 +3556,7 @@
               <w:rPr>
                 <w:sz w:val="15"/>
               </w:rPr>
-              <w:t>42.5</w:t>
+              <w:t>43.8</w:t>
             </w:r>
           </w:p>
         </w:tc>
@@ -3570,7 +3570,7 @@
               <w:rPr>
                 <w:sz w:val="15"/>
               </w:rPr>
-              <w:t>31</w:t>
+              <w:t>9</w:t>
             </w:r>
           </w:p>
         </w:tc>
@@ -3584,7 +3584,7 @@
               <w:rPr>
                 <w:sz w:val="15"/>
               </w:rPr>
-              <w:t>Développeur full stack (21) ; AI Engineer / Développeur IA (12)</w:t>
+              <w:t>Développeur full stack (24) ; Développeur web (intitulé générique) (8)</w:t>
             </w:r>
           </w:p>
         </w:tc>
@@ -3614,7 +3614,7 @@
               <w:rPr>
                 <w:sz w:val="15"/>
               </w:rPr>
-              <w:t>54</w:t>
+              <w:t>63</w:t>
             </w:r>
           </w:p>
         </w:tc>
@@ -3628,7 +3628,7 @@
               <w:rPr>
                 <w:sz w:val="15"/>
               </w:rPr>
-              <w:t>2.0 %</w:t>
+              <w:t>2.1 %</w:t>
             </w:r>
           </w:p>
         </w:tc>
@@ -3642,7 +3642,7 @@
               <w:rPr>
                 <w:sz w:val="15"/>
               </w:rPr>
-              <w:t>5.6</w:t>
+              <w:t>4.8</w:t>
             </w:r>
           </w:p>
         </w:tc>
@@ -3656,7 +3656,7 @@
               <w:rPr>
                 <w:sz w:val="15"/>
               </w:rPr>
-              <w:t>16.0</w:t>
+              <w:t>20.0</w:t>
             </w:r>
           </w:p>
         </w:tc>
@@ -3670,7 +3670,7 @@
               <w:rPr>
                 <w:sz w:val="15"/>
               </w:rPr>
-              <w:t>6</w:t>
+              <w:t>11</w:t>
             </w:r>
           </w:p>
         </w:tc>
@@ -3684,7 +3684,7 @@
               <w:rPr>
                 <w:sz w:val="15"/>
               </w:rPr>
-              <w:t>Développeur full stack (19) ; Développeur back-end (6)</w:t>
+              <w:t>Développeur full stack (22) ; Développeur back-end (6)</w:t>
             </w:r>
           </w:p>
         </w:tc>
@@ -3714,7 +3714,7 @@
               <w:rPr>
                 <w:sz w:val="15"/>
               </w:rPr>
-              <w:t>51</w:t>
+              <w:t>52</w:t>
             </w:r>
           </w:p>
         </w:tc>
@@ -3728,7 +3728,7 @@
               <w:rPr>
                 <w:sz w:val="15"/>
               </w:rPr>
-              <w:t>1.9 %</w:t>
+              <w:t>1.8 %</w:t>
             </w:r>
           </w:p>
         </w:tc>
@@ -3742,7 +3742,7 @@
               <w:rPr>
                 <w:sz w:val="15"/>
               </w:rPr>
-              <w:t>13.7</w:t>
+              <w:t>13.5</w:t>
             </w:r>
           </w:p>
         </w:tc>
@@ -3800,7 +3800,7 @@
               <w:rPr>
                 <w:sz w:val="15"/>
               </w:rPr>
-              <w:t>Bourgogne-Franche-Comté</w:t>
+              <w:t>Centre-Val de Loire</w:t>
             </w:r>
           </w:p>
         </w:tc>
@@ -3814,7 +3814,7 @@
               <w:rPr>
                 <w:sz w:val="15"/>
               </w:rPr>
-              <w:t>46</w:t>
+              <w:t>50</w:t>
             </w:r>
           </w:p>
         </w:tc>
@@ -3842,7 +3842,7 @@
               <w:rPr>
                 <w:sz w:val="15"/>
               </w:rPr>
-              <w:t>6.5</w:t>
+              <w:t>2.0</w:t>
             </w:r>
           </w:p>
         </w:tc>
@@ -3856,7 +3856,7 @@
               <w:rPr>
                 <w:sz w:val="15"/>
               </w:rPr>
-              <w:t>46.2</w:t>
+              <w:t>50.0</w:t>
             </w:r>
           </w:p>
         </w:tc>
@@ -3870,7 +3870,7 @@
               <w:rPr>
                 <w:sz w:val="15"/>
               </w:rPr>
-              <w:t>3</w:t>
+              <w:t>1</w:t>
             </w:r>
           </w:p>
         </w:tc>
@@ -3884,7 +3884,7 @@
               <w:rPr>
                 <w:sz w:val="15"/>
               </w:rPr>
-              <w:t>Développeur full stack (9) ; Concepteur développeur d'applications / logiciel (6)</w:t>
+              <w:t>Développeur full stack (12) ; Développeur .NET / C# (12)</w:t>
             </w:r>
           </w:p>
         </w:tc>
@@ -3900,7 +3900,7 @@
               <w:rPr>
                 <w:sz w:val="15"/>
               </w:rPr>
-              <w:t>Centre-Val de Loire</w:t>
+              <w:t>Bourgogne-Franche-Comté</w:t>
             </w:r>
           </w:p>
         </w:tc>
@@ -3914,7 +3914,7 @@
               <w:rPr>
                 <w:sz w:val="15"/>
               </w:rPr>
-              <w:t>44</w:t>
+              <w:t>49</w:t>
             </w:r>
           </w:p>
         </w:tc>
@@ -3942,7 +3942,7 @@
               <w:rPr>
                 <w:sz w:val="15"/>
               </w:rPr>
-              <w:t>2.3</w:t>
+              <w:t>6.1</w:t>
             </w:r>
           </w:p>
         </w:tc>
@@ -3956,7 +3956,7 @@
               <w:rPr>
                 <w:sz w:val="15"/>
               </w:rPr>
-              <w:t>50.0</w:t>
+              <w:t>43.8</w:t>
             </w:r>
           </w:p>
         </w:tc>
@@ -3970,7 +3970,7 @@
               <w:rPr>
                 <w:sz w:val="15"/>
               </w:rPr>
-              <w:t>0</w:t>
+              <w:t>3</w:t>
             </w:r>
           </w:p>
         </w:tc>
@@ -3984,7 +3984,7 @@
               <w:rPr>
                 <w:sz w:val="15"/>
               </w:rPr>
-              <w:t>Développeur .NET / C# (12) ; Développeur full stack (7)</w:t>
+              <w:t>Développeur full stack (12) ; Concepteur développeur d'applications / logiciel (6)</w:t>
             </w:r>
           </w:p>
         </w:tc>
@@ -4128,7 +4128,7 @@
               <w:rPr>
                 <w:sz w:val="15"/>
               </w:rPr>
-              <w:t>0.2 %</w:t>
+              <w:t>0.1 %</w:t>
             </w:r>
           </w:p>
         </w:tc>
@@ -4431,7 +4431,7 @@
         <w:pStyle w:val="ListBullet"/>
       </w:pPr>
       <w:r>
-        <w:t>Télétravail : 10.0 % des offres uniques de l'échantillon (265 offres) mentionnent dans leur titre ou extrait un télétravail total ou partiel (les extraits ne signalent pas l'absence de télétravail, la part réelle est donc supérieure) ; Indeed compte plus de 300 offres « Développeur Web Remote » (2 sept. 2026) et plus de 100 « Télétravail Développeur Full Stack » (29 mai 2026), soit environ un dixième du stock national : le marché à distance existe mais reste minoritaire et plutôt réservé aux profils expérimentés.</w:t>
+        <w:t>Télétravail : 10.8 % des offres uniques de l'échantillon (320 offres) mentionnent dans leur titre ou extrait un télétravail total ou partiel (les extraits ne signalent pas l'absence de télétravail, la part réelle est donc supérieure) ; Indeed compte plus de 300 offres « Développeur Web Remote » (2 sept. 2026) et plus de 100 « Télétravail Développeur Full Stack » (29 mai 2026), soit environ un dixième du stock national : le marché à distance existe mais reste minoritaire et plutôt réservé aux profils expérimentés.</w:t>
       </w:r>
     </w:p>
     <w:p>
@@ -4439,7 +4439,7 @@
         <w:pStyle w:val="ListBullet"/>
       </w:pPr>
       <w:r>
-        <w:t>Offres pour 100 000 actifs (ESTIMATION sur l'échantillon, population active régionale relevée dans les études Insee ou relais Insee, millésimes 2018-2023, Excel T_ACTIFS_REGIONS) : Pays de la Loire 14.3 (n=251, actifs 2018) ; Île-de-France 12.9 (n=764, actifs 2019) ; Auvergne-Rhône-Alpes 10.0 (n=381, actifs 2018) ; Occitanie 6.6 (n=181, actifs 2022) ; Hauts-de-France 6.6 (n=180, actifs 2022) ; Nouvelle-Aquitaine 6.0 (n=217, actifs 2020) ; Bretagne 5.9 (n=88, actifs 2022) ; Grand Est 3.9 (n=101, actifs 2022) ; Centre-Val de Loire 3.8 (n=44, actifs 2021) ; Bourgogne-Franche-Comté 3.6 (n=46, actifs 2021) ; Normandie 3.4 (n=51, actifs 2022) ; Martinique 2.2 (n=3, actifs 2022) ; La Réunion 1.4 (n=5, actifs 2023). Ce ratio mesure l'intensité de l'échantillon collecté, pas celle du marché total : il est biaisé par l'effort de collecte consacré aux villes NEXA (Pays de la Loire, Auvergne-Rhône-Alpes, Île-de-France) ; les régions sans valeur d'actifs (PACA, Corse, Guyane, Mayotte) restent NC.</w:t>
+        <w:t>Offres pour 100 000 actifs (ESTIMATION sur l'échantillon, population active régionale relevée dans les études Insee ou relais Insee, millésimes 2018-2023, Excel T_ACTIFS_REGIONS) : Pays de la Loire 15.3 (n=269, actifs 2018) ; Île-de-France 14.8 (n=875, actifs 2019) ; Auvergne-Rhône-Alpes 11.6 (n=439, actifs 2018) ; Occitanie 7.3 (n=199, actifs 2022) ; Hauts-de-France 7.2 (n=196, actifs 2022) ; Bretagne 6.6 (n=99, actifs 2022) ; Nouvelle-Aquitaine 6.3 (n=227, actifs 2020) ; Centre-Val de Loire 4.3 (n=50, actifs 2021) ; Grand Est 4.2 (n=109, actifs 2022) ; Bourgogne-Franche-Comté 3.9 (n=49, actifs 2021) ; Normandie 3.5 (n=52, actifs 2022) ; Martinique 2.2 (n=3, actifs 2022) ; La Réunion 1.4 (n=5, actifs 2023). Ce ratio mesure l'intensité de l'échantillon collecté, pas celle du marché total : il est biaisé par l'effort de collecte consacré aux villes NEXA (Pays de la Loire, Auvergne-Rhône-Alpes, Île-de-France) ; les régions sans valeur d'actifs (PACA, Corse, Guyane, Mayotte) restent NC.</w:t>
       </w:r>
     </w:p>
     <w:p>
@@ -4448,7 +4448,7 @@
           <w:b/>
           <w:i w:val="0"/>
         </w:rPr>
-        <w:t>Réponse à la question 7 : l'Île-de-France concentre entre un quart et un tiers de la demande nationale (29 % des offres Apec ; 28.9 % de notre échantillon), suivie d'Auvergne-Rhône-Alpes (Lyon, Grenoble), d'Occitanie (Toulouse, Montpellier), des Hauts-de-France, de la Nouvelle-Aquitaine, des Pays de la Loire et de PACA. Les six campus NEXA couvrent les six premiers bassins hors Toulouse. Confiance MOYENNE (échantillon) à FORTE (BMO/Apec).</w:t>
+        <w:t>Réponse à la question 7 : l'Île-de-France concentre entre un quart et un tiers de la demande nationale (29 % des offres Apec ; 29.6 % de notre échantillon), suivie d'Auvergne-Rhône-Alpes (Lyon, Grenoble), d'Occitanie (Toulouse, Montpellier), des Hauts-de-France, de la Nouvelle-Aquitaine, des Pays de la Loire et de PACA. Les six campus NEXA couvrent les six premiers bassins hors Toulouse. Confiance MOYENNE (échantillon) à FORTE (BMO/Apec).</w:t>
       </w:r>
     </w:p>
     <w:p>
@@ -4647,7 +4647,7 @@
               <w:rPr>
                 <w:sz w:val="15"/>
               </w:rPr>
-              <w:t>764</w:t>
+              <w:t>875</w:t>
             </w:r>
           </w:p>
         </w:tc>
@@ -4661,7 +4661,7 @@
               <w:rPr>
                 <w:sz w:val="15"/>
               </w:rPr>
-              <w:t>Développeur full stack (175) ; AI Engineer / Développeur IA (66) ; Développeur front-end (62)</w:t>
+              <w:t>Développeur full stack (219) ; AI Engineer / Développeur IA (79) ; Développeur front-end (70)</w:t>
             </w:r>
           </w:p>
         </w:tc>
@@ -4675,7 +4675,7 @@
               <w:rPr>
                 <w:sz w:val="15"/>
               </w:rPr>
-              <w:t>19.2 %</w:t>
+              <w:t>21.8 %</w:t>
             </w:r>
           </w:p>
         </w:tc>
@@ -4689,7 +4689,7 @@
               <w:rPr>
                 <w:sz w:val="15"/>
               </w:rPr>
-              <w:t>43.8 %</w:t>
+              <w:t>45.5 %</w:t>
             </w:r>
           </w:p>
         </w:tc>
@@ -4703,7 +4703,7 @@
               <w:rPr>
                 <w:sz w:val="15"/>
               </w:rPr>
-              <w:t>44.7 %</w:t>
+              <w:t>42.8 %</w:t>
             </w:r>
           </w:p>
         </w:tc>
@@ -4717,7 +4717,7 @@
               <w:rPr>
                 <w:sz w:val="15"/>
               </w:rPr>
-              <w:t>20.0 %</w:t>
+              <w:t>20.6 %</w:t>
             </w:r>
           </w:p>
         </w:tc>
@@ -4731,7 +4731,7 @@
               <w:rPr>
                 <w:sz w:val="15"/>
               </w:rPr>
-              <w:t>51250 € (n=59)</w:t>
+              <w:t>52500 € (n=69)</w:t>
             </w:r>
           </w:p>
         </w:tc>
@@ -4761,7 +4761,7 @@
               <w:rPr>
                 <w:sz w:val="15"/>
               </w:rPr>
-              <w:t>279</w:t>
+              <w:t>323</w:t>
             </w:r>
           </w:p>
         </w:tc>
@@ -4775,7 +4775,7 @@
               <w:rPr>
                 <w:sz w:val="15"/>
               </w:rPr>
-              <w:t>Développeur full stack (69) ; Développeur Java / Spring (20) ; Tech Lead / Lead Developer (18)</w:t>
+              <w:t>Développeur full stack (81) ; Développeur Java / Spring (24) ; Développeur front-end (20)</w:t>
             </w:r>
           </w:p>
         </w:tc>
@@ -4789,7 +4789,7 @@
               <w:rPr>
                 <w:sz w:val="15"/>
               </w:rPr>
-              <w:t>28.0 %</w:t>
+              <w:t>27.1 %</w:t>
             </w:r>
           </w:p>
         </w:tc>
@@ -4803,7 +4803,7 @@
               <w:rPr>
                 <w:sz w:val="15"/>
               </w:rPr>
-              <w:t>43.7 %</w:t>
+              <w:t>42.9 %</w:t>
             </w:r>
           </w:p>
         </w:tc>
@@ -4817,7 +4817,7 @@
               <w:rPr>
                 <w:sz w:val="15"/>
               </w:rPr>
-              <w:t>39.7 %</w:t>
+              <w:t>40.8 %</w:t>
             </w:r>
           </w:p>
         </w:tc>
@@ -4831,7 +4831,7 @@
               <w:rPr>
                 <w:sz w:val="15"/>
               </w:rPr>
-              <w:t>5.4 %</w:t>
+              <w:t>4.6 %</w:t>
             </w:r>
           </w:p>
         </w:tc>
@@ -4845,7 +4845,7 @@
               <w:rPr>
                 <w:sz w:val="15"/>
               </w:rPr>
-              <w:t>44175 € (n=30)</w:t>
+              <w:t>44350 € (n=40)</w:t>
             </w:r>
           </w:p>
         </w:tc>
@@ -4875,7 +4875,7 @@
               <w:rPr>
                 <w:sz w:val="15"/>
               </w:rPr>
-              <w:t>153</w:t>
+              <w:t>168</w:t>
             </w:r>
           </w:p>
         </w:tc>
@@ -4889,7 +4889,7 @@
               <w:rPr>
                 <w:sz w:val="15"/>
               </w:rPr>
-              <w:t>Développeur full stack (49) ; Développeur Java / Spring (15) ; Développeur .NET / C# (10)</w:t>
+              <w:t>Développeur full stack (56) ; Développeur Java / Spring (18) ; Développeur .NET / C# (10)</w:t>
             </w:r>
           </w:p>
         </w:tc>
@@ -4903,7 +4903,7 @@
               <w:rPr>
                 <w:sz w:val="15"/>
               </w:rPr>
-              <w:t>27.5 %</w:t>
+              <w:t>26.9 %</w:t>
             </w:r>
           </w:p>
         </w:tc>
@@ -4917,7 +4917,7 @@
               <w:rPr>
                 <w:sz w:val="15"/>
               </w:rPr>
-              <w:t>39.7 %</w:t>
+              <w:t>39.2 %</w:t>
             </w:r>
           </w:p>
         </w:tc>
@@ -4931,7 +4931,7 @@
               <w:rPr>
                 <w:sz w:val="15"/>
               </w:rPr>
-              <w:t>48.5 %</w:t>
+              <w:t>44.3 %</w:t>
             </w:r>
           </w:p>
         </w:tc>
@@ -4945,7 +4945,7 @@
               <w:rPr>
                 <w:sz w:val="15"/>
               </w:rPr>
-              <w:t>9.8 %</w:t>
+              <w:t>9.5 %</w:t>
             </w:r>
           </w:p>
         </w:tc>
@@ -4959,7 +4959,7 @@
               <w:rPr>
                 <w:sz w:val="15"/>
               </w:rPr>
-              <w:t>44250 € (n=8)</w:t>
+              <w:t>43750 € (n=10)</w:t>
             </w:r>
           </w:p>
         </w:tc>
@@ -4989,7 +4989,7 @@
               <w:rPr>
                 <w:sz w:val="15"/>
               </w:rPr>
-              <w:t>147</w:t>
+              <w:t>157</w:t>
             </w:r>
           </w:p>
         </w:tc>
@@ -5003,7 +5003,7 @@
               <w:rPr>
                 <w:sz w:val="15"/>
               </w:rPr>
-              <w:t>Développeur full stack (36) ; Développeur web (intitulé générique) (11) ; Développeur front-end (9)</w:t>
+              <w:t>Développeur full stack (38) ; Développeur web (intitulé générique) (11) ; Développeur Java / Spring (10)</w:t>
             </w:r>
           </w:p>
         </w:tc>
@@ -5017,7 +5017,7 @@
               <w:rPr>
                 <w:sz w:val="15"/>
               </w:rPr>
-              <w:t>28.2 %</w:t>
+              <w:t>25.8 %</w:t>
             </w:r>
           </w:p>
         </w:tc>
@@ -5031,7 +5031,7 @@
               <w:rPr>
                 <w:sz w:val="15"/>
               </w:rPr>
-              <w:t>43.3 %</w:t>
+              <w:t>40.3 %</w:t>
             </w:r>
           </w:p>
         </w:tc>
@@ -5045,7 +5045,7 @@
               <w:rPr>
                 <w:sz w:val="15"/>
               </w:rPr>
-              <w:t>38.8 %</w:t>
+              <w:t>40.3 %</w:t>
             </w:r>
           </w:p>
         </w:tc>
@@ -5059,7 +5059,7 @@
               <w:rPr>
                 <w:sz w:val="15"/>
               </w:rPr>
-              <w:t>9.5 %</w:t>
+              <w:t>8.9 %</w:t>
             </w:r>
           </w:p>
         </w:tc>
@@ -5073,7 +5073,7 @@
               <w:rPr>
                 <w:sz w:val="15"/>
               </w:rPr>
-              <w:t>43700 € (n=13)</w:t>
+              <w:t>43400 € (n=14)</w:t>
             </w:r>
           </w:p>
         </w:tc>
@@ -5103,7 +5103,7 @@
               <w:rPr>
                 <w:sz w:val="15"/>
               </w:rPr>
-              <w:t>199</w:t>
+              <w:t>214</w:t>
             </w:r>
           </w:p>
         </w:tc>
@@ -5117,7 +5117,7 @@
               <w:rPr>
                 <w:sz w:val="15"/>
               </w:rPr>
-              <w:t>Développeur full stack (48) ; DevOps Engineer (21) ; Développeur Java / Spring (18)</w:t>
+              <w:t>Développeur full stack (50) ; DevOps Engineer (21) ; Développeur Java / Spring (18)</w:t>
             </w:r>
           </w:p>
         </w:tc>
@@ -5131,7 +5131,7 @@
               <w:rPr>
                 <w:sz w:val="15"/>
               </w:rPr>
-              <w:t>16.2 %</w:t>
+              <w:t>14.8 %</w:t>
             </w:r>
           </w:p>
         </w:tc>
@@ -5145,7 +5145,7 @@
               <w:rPr>
                 <w:sz w:val="15"/>
               </w:rPr>
-              <w:t>33.3 %</w:t>
+              <w:t>30.6 %</w:t>
             </w:r>
           </w:p>
         </w:tc>
@@ -5159,7 +5159,7 @@
               <w:rPr>
                 <w:sz w:val="15"/>
               </w:rPr>
-              <w:t>47.4 %</w:t>
+              <w:t>48.2 %</w:t>
             </w:r>
           </w:p>
         </w:tc>
@@ -5173,7 +5173,7 @@
               <w:rPr>
                 <w:sz w:val="15"/>
               </w:rPr>
-              <w:t>10.1 %</w:t>
+              <w:t>10.3 %</w:t>
             </w:r>
           </w:p>
         </w:tc>
@@ -5187,7 +5187,7 @@
               <w:rPr>
                 <w:sz w:val="15"/>
               </w:rPr>
-              <w:t>40500 € (n=11)</w:t>
+              <w:t>41250 € (n=12)</w:t>
             </w:r>
           </w:p>
         </w:tc>
@@ -5217,7 +5217,7 @@
               <w:rPr>
                 <w:sz w:val="15"/>
               </w:rPr>
-              <w:t>126</w:t>
+              <w:t>136</w:t>
             </w:r>
           </w:p>
         </w:tc>
@@ -5231,7 +5231,7 @@
               <w:rPr>
                 <w:sz w:val="15"/>
               </w:rPr>
-              <w:t>Développeur full stack (32) ; Développeur (intitulé générique) (11) ; Développeur web (intitulé générique) (10)</w:t>
+              <w:t>Développeur full stack (35) ; Développeur (intitulé générique) (12) ; Développeur web (intitulé générique) (10)</w:t>
             </w:r>
           </w:p>
         </w:tc>
@@ -5245,7 +5245,7 @@
               <w:rPr>
                 <w:sz w:val="15"/>
               </w:rPr>
-              <w:t>34.9 %</w:t>
+              <w:t>35.2 %</w:t>
             </w:r>
           </w:p>
         </w:tc>
@@ -5259,7 +5259,7 @@
               <w:rPr>
                 <w:sz w:val="15"/>
               </w:rPr>
-              <w:t>50.9 %</w:t>
+              <w:t>50.0 %</w:t>
             </w:r>
           </w:p>
         </w:tc>
@@ -5273,7 +5273,7 @@
               <w:rPr>
                 <w:sz w:val="15"/>
               </w:rPr>
-              <w:t>34.5 %</w:t>
+              <w:t>35.5 %</w:t>
             </w:r>
           </w:p>
         </w:tc>
@@ -5287,7 +5287,7 @@
               <w:rPr>
                 <w:sz w:val="15"/>
               </w:rPr>
-              <w:t>4.8 %</w:t>
+              <w:t>6.6 %</w:t>
             </w:r>
           </w:p>
         </w:tc>
@@ -5301,7 +5301,7 @@
               <w:rPr>
                 <w:sz w:val="15"/>
               </w:rPr>
-              <w:t>42500 € (n=14)</w:t>
+              <w:t>42500 € (n=15)</w:t>
             </w:r>
           </w:p>
         </w:tc>
@@ -5331,7 +5331,7 @@
               <w:rPr>
                 <w:sz w:val="15"/>
               </w:rPr>
-              <w:t>54</w:t>
+              <w:t>63</w:t>
             </w:r>
           </w:p>
         </w:tc>
@@ -5345,7 +5345,7 @@
               <w:rPr>
                 <w:sz w:val="15"/>
               </w:rPr>
-              <w:t>Développeur full stack (19) ; Développeur back-end (6) ; Tech Lead / Lead Developer (5)</w:t>
+              <w:t>Développeur full stack (22) ; Développeur back-end (6) ; Tech Lead / Lead Developer (4)</w:t>
             </w:r>
           </w:p>
         </w:tc>
@@ -5359,7 +5359,7 @@
               <w:rPr>
                 <w:sz w:val="15"/>
               </w:rPr>
-              <w:t>8.6 %</w:t>
+              <w:t>7.1 %</w:t>
             </w:r>
           </w:p>
         </w:tc>
@@ -5373,7 +5373,7 @@
               <w:rPr>
                 <w:sz w:val="15"/>
               </w:rPr>
-              <w:t>16.0 %</w:t>
+              <w:t>20.0 %</w:t>
             </w:r>
           </w:p>
         </w:tc>
@@ -5387,7 +5387,7 @@
               <w:rPr>
                 <w:sz w:val="15"/>
               </w:rPr>
-              <w:t>68.0 %</w:t>
+              <w:t>66.7 %</w:t>
             </w:r>
           </w:p>
         </w:tc>
@@ -5401,7 +5401,7 @@
               <w:rPr>
                 <w:sz w:val="15"/>
               </w:rPr>
-              <w:t>11.1 %</w:t>
+              <w:t>17.5 %</w:t>
             </w:r>
           </w:p>
         </w:tc>
@@ -5415,7 +5415,7 @@
               <w:rPr>
                 <w:sz w:val="15"/>
               </w:rPr>
-              <w:t>56250 € (n=4)</w:t>
+              <w:t>55000 € (n=5)</w:t>
             </w:r>
           </w:p>
         </w:tc>
@@ -5427,7 +5427,7 @@
         <w:pStyle w:val="ListBullet"/>
       </w:pPr>
       <w:r>
-        <w:t>Paris et Île-de-France : Marché le plus profond (Indeed « Développeur Web » plus de 900 offres actives à Paris au 4 septembre 2026 ; HelloWork « Développeur » plus de 1 700 en IDF en juillet 2026) et le plus exposé à l'IA : 56.3 % des offres des métiers IA de l'échantillon y sont localisées ; stages et alternances abondants (Indeed « Stage Développeur Web » IDF plus de 800 en janvier 2025). Concurrence forte entre écoles ; les profils juniors doivent se différencier (industrialisation, IA appliquée).</w:t>
+        <w:t>Paris et Île-de-France : Marché le plus profond (Indeed « Développeur Web » plus de 900 offres actives à Paris au 4 septembre 2026 ; HelloWork « Développeur » plus de 1 700 en IDF en juillet 2026) et le plus exposé à l'IA : 56.2 % des offres des métiers IA de l'échantillon y sont localisées ; stages et alternances abondants (Indeed « Stage Développeur Web » IDF plus de 800 en janvier 2025). Concurrence forte entre écoles ; les profils juniors doivent se différencier (industrialisation, IA appliquée).</w:t>
       </w:r>
     </w:p>
     <w:p>
@@ -5484,7 +5484,7 @@
           <w:b/>
           <w:i w:val="0"/>
         </w:rPr>
-        <w:t>Réponse à la question 12 (adaptations par campus) : socle commun identique sur les six campus, mais accent alternance et e-commerce/retail à Lille et Nantes, industrialisation et ESN à Lyon, IA appliquée et scale-ups à Paris, préparation au marché à distance et à la mobilité à Marseille-Aix et Bordeaux, où le volume local reste limité. Confiance MOYENNE (échantillon de 54 à 764 offres par ville).</w:t>
+        <w:t>Réponse à la question 12 (adaptations par campus) : socle commun identique sur les six campus, mais accent alternance et e-commerce/retail à Lille et Nantes, industrialisation et ESN à Lyon, IA appliquée et scale-ups à Paris, préparation au marché à distance et à la mobilité à Marseille-Aix et Bordeaux, où le volume local reste limité. Confiance MOYENNE (échantillon de 63 à 875 offres par ville).</w:t>
       </w:r>
     </w:p>
     <w:p>
@@ -5501,7 +5501,7 @@
           <w:b w:val="0"/>
           <w:i w:val="0"/>
         </w:rPr>
-        <w:t>Sur les 1478 offres uniques dont le contrat est renseigné : CDI 68.8 %, alternance 16.7 %, stage 5.6 %, freelance 5.7 %, CDD 2.6 %. Sur les 1112 offres dont la séniorité est déterminable (expérience demandée ou contrat stage/alternance) : DEBUTANT 32.4 %, JUNIOR 11.6 %, INTERMEDIAIRE 13.9 %, SENIOR 29.9 %, LEAD/ARCHITECTE 12.1 %. Les offres DEBUTANT sont à 87.8 % des stages ou alternances ; seules 83 offres débutant/junior en CDI ont été observées. Excel, SYNTHESE_METIERS (colonnes CDI…LEAD_ARCHITECTE) et OFFRES_DETAILLEES (SENIORITE, SENIORITE_ORIGINE).</w:t>
+        <w:t>Sur les 1717 offres uniques dont le contrat est renseigné : CDI 68.4 %, alternance 16.2 %, stage 6.3 %, freelance 6.1 %, CDD 2.5 %. Sur les 1287 offres dont la séniorité est déterminable (expérience demandée ou contrat stage/alternance) : DEBUTANT 32.2 %, JUNIOR 11.7 %, INTERMEDIAIRE 15.1 %, SENIOR 29.3 %, LEAD/ARCHITECTE 11.8 %. Les offres DEBUTANT sont à 88.4 % des stages ou alternances ; seules 93 offres débutant/junior en CDI ont été observées. Excel, SYNTHESE_METIERS (colonnes CDI…LEAD_ARCHITECTE) et OFFRES_DETAILLEES (SENIORITE, SENIORITE_ORIGINE).</w:t>
       </w:r>
     </w:p>
     <w:p>
@@ -5824,7 +5824,7 @@
               <w:rPr>
                 <w:sz w:val="16"/>
               </w:rPr>
-              <w:t>360</w:t>
+              <w:t>414</w:t>
             </w:r>
           </w:p>
         </w:tc>
@@ -5838,7 +5838,7 @@
               <w:rPr>
                 <w:sz w:val="16"/>
               </w:rPr>
-              <w:t>15</w:t>
+              <w:t>16</w:t>
             </w:r>
           </w:p>
         </w:tc>
@@ -5866,7 +5866,7 @@
               <w:rPr>
                 <w:sz w:val="16"/>
               </w:rPr>
-              <w:t>238</w:t>
+              <w:t>264</w:t>
             </w:r>
           </w:p>
         </w:tc>
@@ -5880,7 +5880,7 @@
               <w:rPr>
                 <w:sz w:val="16"/>
               </w:rPr>
-              <w:t>78</w:t>
+              <w:t>102</w:t>
             </w:r>
           </w:p>
         </w:tc>
@@ -5908,7 +5908,7 @@
               <w:rPr>
                 <w:sz w:val="16"/>
               </w:rPr>
-              <w:t>29</w:t>
+              <w:t>32</w:t>
             </w:r>
           </w:p>
         </w:tc>
@@ -5938,7 +5938,7 @@
               <w:rPr>
                 <w:sz w:val="16"/>
               </w:rPr>
-              <w:t>129</w:t>
+              <w:t>150</w:t>
             </w:r>
           </w:p>
         </w:tc>
@@ -5952,7 +5952,7 @@
               <w:rPr>
                 <w:sz w:val="16"/>
               </w:rPr>
-              <w:t>68</w:t>
+              <w:t>77</w:t>
             </w:r>
           </w:p>
         </w:tc>
@@ -5980,7 +5980,7 @@
               <w:rPr>
                 <w:sz w:val="16"/>
               </w:rPr>
-              <w:t>8</w:t>
+              <w:t>13</w:t>
             </w:r>
           </w:p>
         </w:tc>
@@ -5994,7 +5994,7 @@
               <w:rPr>
                 <w:sz w:val="16"/>
               </w:rPr>
-              <w:t>5</w:t>
+              <w:t>6</w:t>
             </w:r>
           </w:p>
         </w:tc>
@@ -6022,7 +6022,7 @@
               <w:rPr>
                 <w:sz w:val="16"/>
               </w:rPr>
-              <w:t>43</w:t>
+              <w:t>49</w:t>
             </w:r>
           </w:p>
         </w:tc>
@@ -6052,7 +6052,7 @@
               <w:rPr>
                 <w:sz w:val="16"/>
               </w:rPr>
-              <w:t>155</w:t>
+              <w:t>194</w:t>
             </w:r>
           </w:p>
         </w:tc>
@@ -6066,7 +6066,7 @@
               <w:rPr>
                 <w:sz w:val="16"/>
               </w:rPr>
-              <w:t>89</w:t>
+              <w:t>126</w:t>
             </w:r>
           </w:p>
         </w:tc>
@@ -6136,7 +6136,7 @@
               <w:rPr>
                 <w:sz w:val="16"/>
               </w:rPr>
-              <w:t>58</w:t>
+              <w:t>60</w:t>
             </w:r>
           </w:p>
         </w:tc>
@@ -6166,7 +6166,7 @@
               <w:rPr>
                 <w:sz w:val="16"/>
               </w:rPr>
-              <w:t>333</w:t>
+              <w:t>377</w:t>
             </w:r>
           </w:p>
         </w:tc>
@@ -6180,7 +6180,7 @@
               <w:rPr>
                 <w:sz w:val="16"/>
               </w:rPr>
-              <w:t>151</w:t>
+              <w:t>184</w:t>
             </w:r>
           </w:p>
         </w:tc>
@@ -6236,7 +6236,7 @@
               <w:rPr>
                 <w:sz w:val="16"/>
               </w:rPr>
-              <w:t>21</w:t>
+              <w:t>23</w:t>
             </w:r>
           </w:p>
         </w:tc>
@@ -6250,7 +6250,7 @@
               <w:rPr>
                 <w:sz w:val="16"/>
               </w:rPr>
-              <w:t>157</w:t>
+              <w:t>166</w:t>
             </w:r>
           </w:p>
         </w:tc>
@@ -6280,7 +6280,7 @@
               <w:rPr>
                 <w:sz w:val="16"/>
               </w:rPr>
-              <w:t>135</w:t>
+              <w:t>152</w:t>
             </w:r>
           </w:p>
         </w:tc>
@@ -6294,7 +6294,7 @@
               <w:rPr>
                 <w:sz w:val="16"/>
               </w:rPr>
-              <w:t>59</w:t>
+              <w:t>72</w:t>
             </w:r>
           </w:p>
         </w:tc>
@@ -6350,7 +6350,7 @@
               <w:rPr>
                 <w:sz w:val="16"/>
               </w:rPr>
-              <w:t>4</w:t>
+              <w:t>5</w:t>
             </w:r>
           </w:p>
         </w:tc>
@@ -6364,7 +6364,7 @@
               <w:rPr>
                 <w:sz w:val="16"/>
               </w:rPr>
-              <w:t>71</w:t>
+              <w:t>74</w:t>
             </w:r>
           </w:p>
         </w:tc>
@@ -6377,7 +6377,7 @@
           <w:b/>
           <w:i w:val="0"/>
         </w:rPr>
-        <w:t>Réponses aux questions 4, 5 et 6 : les entreprises recrutent encore des juniors, mais surtout en alternance et en stage (dans l'échantillon, l'alternance et le stage représentent 22.3 % des contrats renseignés et la quasi-totalité des offres débutant) ; le CDI direct pour débutant est rare et concentré dans les ESN et les PME ; la demande en CDI se concentre sur les profils intermédiaires et seniors (3 ans et plus) ; le freelance et les missions courtes concernent les profils confirmés. Confiance FORTE sur la tendance (Apec, Numeum convergents), MOYENNE sur les proportions (échantillon).</w:t>
+        <w:t>Réponses aux questions 4, 5 et 6 : les entreprises recrutent encore des juniors, mais surtout en alternance et en stage (dans l'échantillon, l'alternance et le stage représentent 22.5 % des contrats renseignés et la quasi-totalité des offres débutant) ; le CDI direct pour débutant est rare et concentré dans les ESN et les PME ; la demande en CDI se concentre sur les profils intermédiaires et seniors (3 ans et plus) ; le freelance et les missions courtes concernent les profils confirmés. Confiance FORTE sur la tendance (Apec, Numeum convergents), MOYENNE sur les proportions (échantillon).</w:t>
       </w:r>
     </w:p>
     <w:p>
@@ -6394,7 +6394,7 @@
           <w:b w:val="0"/>
           <w:i w:val="0"/>
         </w:rPr>
-        <w:t>Salaires affichés dans les offres collectées (SALAIRE_AFFICHE_DANS_OFFRE) : 238 offres uniques avec une fourchette annuelle ; médiane 43500 € brut/an, quartile bas 39375 €, quartile haut 49625 € ; fourchettes observées de 16344 € (Alternance en Développement Informatique PHP (H/F), Marseille) à 75000 € (Développeur Full Stack Senior Java React Freelance, Paris) ; 34 offres (alternances) affichent un salaire mensuel de 486 à 4200 €/mois. Effectif faible : à lire comme des ordres de grandeur. Excel, OFFRES_DETAILLEES (SALAIRE_MIN_NUM, SALAIRE_MAX_NUM).</w:t>
+        <w:t>Salaires affichés dans les offres collectées (SALAIRE_AFFICHE_DANS_OFFRE) : 282 offres uniques avec une fourchette annuelle ; médiane 43750 € brut/an, quartile bas 40000 €, quartile haut 49625 € ; fourchettes observées de 16344 € (Alternance en Développement Informatique PHP (H/F), Marseille) à 90000 € (Lead Développeur Fullstack (Node.js/Typescript – V, Paris) ; 42 offres (alternances) affichent un salaire mensuel de 486 à 4200 €/mois. Effectif faible : à lire comme des ordres de grandeur. Excel, OFFRES_DETAILLEES (SALAIRE_MIN_NUM, SALAIRE_MAX_NUM).</w:t>
       </w:r>
     </w:p>
     <w:p>
@@ -6635,7 +6635,7 @@
               <w:rPr>
                 <w:sz w:val="16"/>
               </w:rPr>
-              <w:t>21</w:t>
+              <w:t>24</w:t>
             </w:r>
           </w:p>
         </w:tc>
@@ -6649,7 +6649,7 @@
               <w:rPr>
                 <w:sz w:val="16"/>
               </w:rPr>
-              <w:t>44750 €</w:t>
+              <w:t>44875 €</w:t>
             </w:r>
           </w:p>
         </w:tc>
@@ -6663,7 +6663,7 @@
               <w:rPr>
                 <w:sz w:val="16"/>
               </w:rPr>
-              <w:t>42250 €</w:t>
+              <w:t>42500 €</w:t>
             </w:r>
           </w:p>
         </w:tc>
@@ -6677,7 +6677,7 @@
               <w:rPr>
                 <w:sz w:val="16"/>
               </w:rPr>
-              <w:t>50625 €</w:t>
+              <w:t>50938 €</w:t>
             </w:r>
           </w:p>
         </w:tc>
@@ -6721,7 +6721,7 @@
               <w:rPr>
                 <w:sz w:val="16"/>
               </w:rPr>
-              <w:t>31</w:t>
+              <w:t>37</w:t>
             </w:r>
           </w:p>
         </w:tc>
@@ -6735,7 +6735,7 @@
               <w:rPr>
                 <w:sz w:val="16"/>
               </w:rPr>
-              <w:t>45000 €</w:t>
+              <w:t>44500 €</w:t>
             </w:r>
           </w:p>
         </w:tc>
@@ -6749,7 +6749,7 @@
               <w:rPr>
                 <w:sz w:val="16"/>
               </w:rPr>
-              <w:t>40000 €</w:t>
+              <w:t>40250 €</w:t>
             </w:r>
           </w:p>
         </w:tc>
@@ -6763,7 +6763,7 @@
               <w:rPr>
                 <w:sz w:val="16"/>
               </w:rPr>
-              <w:t>54500 €</w:t>
+              <w:t>53375 €</w:t>
             </w:r>
           </w:p>
         </w:tc>
@@ -6807,7 +6807,7 @@
               <w:rPr>
                 <w:sz w:val="16"/>
               </w:rPr>
-              <w:t>33</w:t>
+              <w:t>48</w:t>
             </w:r>
           </w:p>
         </w:tc>
@@ -6821,7 +6821,7 @@
               <w:rPr>
                 <w:sz w:val="16"/>
               </w:rPr>
-              <w:t>45600 €</w:t>
+              <w:t>44425 €</w:t>
             </w:r>
           </w:p>
         </w:tc>
@@ -6835,7 +6835,7 @@
               <w:rPr>
                 <w:sz w:val="16"/>
               </w:rPr>
-              <w:t>42500 €</w:t>
+              <w:t>42562 €</w:t>
             </w:r>
           </w:p>
         </w:tc>
@@ -6849,7 +6849,7 @@
               <w:rPr>
                 <w:sz w:val="16"/>
               </w:rPr>
-              <w:t>53700 €</w:t>
+              <w:t>52875 €</w:t>
             </w:r>
           </w:p>
         </w:tc>
@@ -6893,7 +6893,7 @@
               <w:rPr>
                 <w:sz w:val="16"/>
               </w:rPr>
-              <w:t>14</w:t>
+              <w:t>16</w:t>
             </w:r>
           </w:p>
         </w:tc>
@@ -6907,7 +6907,7 @@
               <w:rPr>
                 <w:sz w:val="16"/>
               </w:rPr>
-              <w:t>48000 €</w:t>
+              <w:t>49250 €</w:t>
             </w:r>
           </w:p>
         </w:tc>
@@ -6921,7 +6921,7 @@
               <w:rPr>
                 <w:sz w:val="16"/>
               </w:rPr>
-              <w:t>44000 €</w:t>
+              <w:t>45000 €</w:t>
             </w:r>
           </w:p>
         </w:tc>
@@ -6935,7 +6935,7 @@
               <w:rPr>
                 <w:sz w:val="16"/>
               </w:rPr>
-              <w:t>52250 €</w:t>
+              <w:t>54500 €</w:t>
             </w:r>
           </w:p>
         </w:tc>
@@ -6949,7 +6949,7 @@
               <w:rPr>
                 <w:sz w:val="16"/>
               </w:rPr>
-              <w:t>36200 – 65000 €</w:t>
+              <w:t>36200 – 75000 €</w:t>
             </w:r>
           </w:p>
         </w:tc>
@@ -6979,7 +6979,7 @@
               <w:rPr>
                 <w:sz w:val="16"/>
               </w:rPr>
-              <w:t>128</w:t>
+              <w:t>146</w:t>
             </w:r>
           </w:p>
         </w:tc>
@@ -6993,7 +6993,7 @@
               <w:rPr>
                 <w:sz w:val="16"/>
               </w:rPr>
-              <w:t>42625 €</w:t>
+              <w:t>42975 €</w:t>
             </w:r>
           </w:p>
         </w:tc>
@@ -7007,7 +7007,7 @@
               <w:rPr>
                 <w:sz w:val="16"/>
               </w:rPr>
-              <w:t>38125 €</w:t>
+              <w:t>38875 €</w:t>
             </w:r>
           </w:p>
         </w:tc>
@@ -7194,7 +7194,7 @@
               <w:rPr>
                 <w:sz w:val="16"/>
               </w:rPr>
-              <w:t>59</w:t>
+              <w:t>69</w:t>
             </w:r>
           </w:p>
         </w:tc>
@@ -7208,7 +7208,7 @@
               <w:rPr>
                 <w:sz w:val="16"/>
               </w:rPr>
-              <w:t>51250 €</w:t>
+              <w:t>52500 €</w:t>
             </w:r>
           </w:p>
         </w:tc>
@@ -7222,7 +7222,7 @@
               <w:rPr>
                 <w:sz w:val="16"/>
               </w:rPr>
-              <w:t>42500 €</w:t>
+              <w:t>43000 €</w:t>
             </w:r>
           </w:p>
         </w:tc>
@@ -7250,7 +7250,7 @@
               <w:rPr>
                 <w:sz w:val="16"/>
               </w:rPr>
-              <w:t>18000 – 70000 €</w:t>
+              <w:t>18000 – 75000 €</w:t>
             </w:r>
           </w:p>
         </w:tc>
@@ -7280,7 +7280,7 @@
               <w:rPr>
                 <w:sz w:val="16"/>
               </w:rPr>
-              <w:t>30</w:t>
+              <w:t>40</w:t>
             </w:r>
           </w:p>
         </w:tc>
@@ -7294,7 +7294,7 @@
               <w:rPr>
                 <w:sz w:val="16"/>
               </w:rPr>
-              <w:t>44175 €</w:t>
+              <w:t>44350 €</w:t>
             </w:r>
           </w:p>
         </w:tc>
@@ -7308,7 +7308,7 @@
               <w:rPr>
                 <w:sz w:val="16"/>
               </w:rPr>
-              <w:t>39500 €</w:t>
+              <w:t>40738 €</w:t>
             </w:r>
           </w:p>
         </w:tc>
@@ -7322,7 +7322,7 @@
               <w:rPr>
                 <w:sz w:val="16"/>
               </w:rPr>
-              <w:t>45875 €</w:t>
+              <w:t>45538 €</w:t>
             </w:r>
           </w:p>
         </w:tc>
@@ -7366,7 +7366,7 @@
               <w:rPr>
                 <w:sz w:val="16"/>
               </w:rPr>
-              <w:t>8</w:t>
+              <w:t>10</w:t>
             </w:r>
           </w:p>
         </w:tc>
@@ -7380,7 +7380,7 @@
               <w:rPr>
                 <w:sz w:val="16"/>
               </w:rPr>
-              <w:t>44250 €</w:t>
+              <w:t>43750 €</w:t>
             </w:r>
           </w:p>
         </w:tc>
@@ -7394,7 +7394,7 @@
               <w:rPr>
                 <w:sz w:val="16"/>
               </w:rPr>
-              <w:t>37125 €</w:t>
+              <w:t>41075 €</w:t>
             </w:r>
           </w:p>
         </w:tc>
@@ -7452,7 +7452,7 @@
               <w:rPr>
                 <w:sz w:val="16"/>
               </w:rPr>
-              <w:t>13</w:t>
+              <w:t>14</w:t>
             </w:r>
           </w:p>
         </w:tc>
@@ -7466,7 +7466,7 @@
               <w:rPr>
                 <w:sz w:val="16"/>
               </w:rPr>
-              <w:t>43700 €</w:t>
+              <w:t>43400 €</w:t>
             </w:r>
           </w:p>
         </w:tc>
@@ -7480,7 +7480,7 @@
               <w:rPr>
                 <w:sz w:val="16"/>
               </w:rPr>
-              <w:t>31500 €</w:t>
+              <w:t>33250 €</w:t>
             </w:r>
           </w:p>
         </w:tc>
@@ -7494,7 +7494,7 @@
               <w:rPr>
                 <w:sz w:val="16"/>
               </w:rPr>
-              <w:t>50250 €</w:t>
+              <w:t>50125 €</w:t>
             </w:r>
           </w:p>
         </w:tc>
@@ -7538,7 +7538,7 @@
               <w:rPr>
                 <w:sz w:val="16"/>
               </w:rPr>
-              <w:t>11</w:t>
+              <w:t>12</w:t>
             </w:r>
           </w:p>
         </w:tc>
@@ -7552,7 +7552,7 @@
               <w:rPr>
                 <w:sz w:val="16"/>
               </w:rPr>
-              <w:t>40500 €</w:t>
+              <w:t>41250 €</w:t>
             </w:r>
           </w:p>
         </w:tc>
@@ -7566,7 +7566,7 @@
               <w:rPr>
                 <w:sz w:val="16"/>
               </w:rPr>
-              <w:t>37500 €</w:t>
+              <w:t>38125 €</w:t>
             </w:r>
           </w:p>
         </w:tc>
@@ -7580,7 +7580,7 @@
               <w:rPr>
                 <w:sz w:val="16"/>
               </w:rPr>
-              <w:t>43000 €</w:t>
+              <w:t>44500 €</w:t>
             </w:r>
           </w:p>
         </w:tc>
@@ -7624,7 +7624,7 @@
               <w:rPr>
                 <w:sz w:val="16"/>
               </w:rPr>
-              <w:t>14</w:t>
+              <w:t>15</w:t>
             </w:r>
           </w:p>
         </w:tc>
@@ -7652,7 +7652,7 @@
               <w:rPr>
                 <w:sz w:val="16"/>
               </w:rPr>
-              <w:t>38250 €</w:t>
+              <w:t>39000 €</w:t>
             </w:r>
           </w:p>
         </w:tc>
@@ -7666,7 +7666,7 @@
               <w:rPr>
                 <w:sz w:val="16"/>
               </w:rPr>
-              <w:t>48500 €</w:t>
+              <w:t>47500 €</w:t>
             </w:r>
           </w:p>
         </w:tc>
@@ -7710,7 +7710,7 @@
               <w:rPr>
                 <w:sz w:val="16"/>
               </w:rPr>
-              <w:t>4</w:t>
+              <w:t>5</w:t>
             </w:r>
           </w:p>
         </w:tc>
@@ -7724,7 +7724,7 @@
               <w:rPr>
                 <w:sz w:val="16"/>
               </w:rPr>
-              <w:t>56250 €</w:t>
+              <w:t>55000 €</w:t>
             </w:r>
           </w:p>
         </w:tc>
@@ -7738,7 +7738,7 @@
               <w:rPr>
                 <w:sz w:val="16"/>
               </w:rPr>
-              <w:t>49000 €</w:t>
+              <w:t>43500 €</w:t>
             </w:r>
           </w:p>
         </w:tc>
@@ -7752,7 +7752,7 @@
               <w:rPr>
                 <w:sz w:val="16"/>
               </w:rPr>
-              <w:t>66875 €</w:t>
+              <w:t>63750 €</w:t>
             </w:r>
           </w:p>
         </w:tc>
@@ -7766,7 +7766,7 @@
               <w:rPr>
                 <w:sz w:val="16"/>
               </w:rPr>
-              <w:t>47000 – 70000 €</w:t>
+              <w:t>40000 – 70000 €</w:t>
             </w:r>
           </w:p>
         </w:tc>
@@ -7796,7 +7796,7 @@
               <w:rPr>
                 <w:sz w:val="16"/>
               </w:rPr>
-              <w:t>99</w:t>
+              <w:t>117</w:t>
             </w:r>
           </w:p>
         </w:tc>
@@ -8011,7 +8011,7 @@
               <w:rPr>
                 <w:sz w:val="16"/>
               </w:rPr>
-              <w:t>73</w:t>
+              <w:t>90</w:t>
             </w:r>
           </w:p>
         </w:tc>
@@ -8025,7 +8025,7 @@
               <w:rPr>
                 <w:sz w:val="16"/>
               </w:rPr>
-              <w:t>44350 €</w:t>
+              <w:t>44075 €</w:t>
             </w:r>
           </w:p>
         </w:tc>
@@ -8039,7 +8039,7 @@
               <w:rPr>
                 <w:sz w:val="16"/>
               </w:rPr>
-              <w:t>41250 €</w:t>
+              <w:t>40875 €</w:t>
             </w:r>
           </w:p>
         </w:tc>
@@ -8097,7 +8097,7 @@
               <w:rPr>
                 <w:sz w:val="16"/>
               </w:rPr>
-              <w:t>14</w:t>
+              <w:t>17</w:t>
             </w:r>
           </w:p>
         </w:tc>
@@ -8111,7 +8111,7 @@
               <w:rPr>
                 <w:sz w:val="16"/>
               </w:rPr>
-              <w:t>47725 €</w:t>
+              <w:t>47500 €</w:t>
             </w:r>
           </w:p>
         </w:tc>
@@ -8125,7 +8125,7 @@
               <w:rPr>
                 <w:sz w:val="16"/>
               </w:rPr>
-              <w:t>39750 €</w:t>
+              <w:t>41250 €</w:t>
             </w:r>
           </w:p>
         </w:tc>
@@ -8139,7 +8139,7 @@
               <w:rPr>
                 <w:sz w:val="16"/>
               </w:rPr>
-              <w:t>53650 €</w:t>
+              <w:t>54100 €</w:t>
             </w:r>
           </w:p>
         </w:tc>
@@ -8183,7 +8183,7 @@
               <w:rPr>
                 <w:sz w:val="16"/>
               </w:rPr>
-              <w:t>10</w:t>
+              <w:t>11</w:t>
             </w:r>
           </w:p>
         </w:tc>
@@ -8197,7 +8197,7 @@
               <w:rPr>
                 <w:sz w:val="16"/>
               </w:rPr>
-              <w:t>31500 €</w:t>
+              <w:t>35000 €</w:t>
             </w:r>
           </w:p>
         </w:tc>
@@ -8225,7 +8225,7 @@
               <w:rPr>
                 <w:sz w:val="16"/>
               </w:rPr>
-              <w:t>38625 €</w:t>
+              <w:t>39600 €</w:t>
             </w:r>
           </w:p>
         </w:tc>
@@ -8269,7 +8269,7 @@
               <w:rPr>
                 <w:sz w:val="16"/>
               </w:rPr>
-              <w:t>10</w:t>
+              <w:t>11</w:t>
             </w:r>
           </w:p>
         </w:tc>
@@ -8283,7 +8283,7 @@
               <w:rPr>
                 <w:sz w:val="16"/>
               </w:rPr>
-              <w:t>39500 €</w:t>
+              <w:t>40000 €</w:t>
             </w:r>
           </w:p>
         </w:tc>
@@ -8297,7 +8297,7 @@
               <w:rPr>
                 <w:sz w:val="16"/>
               </w:rPr>
-              <w:t>36250 €</w:t>
+              <w:t>37000 €</w:t>
             </w:r>
           </w:p>
         </w:tc>
@@ -8311,7 +8311,7 @@
               <w:rPr>
                 <w:sz w:val="16"/>
               </w:rPr>
-              <w:t>48125 €</w:t>
+              <w:t>50000 €</w:t>
             </w:r>
           </w:p>
         </w:tc>
@@ -8325,7 +8325,7 @@
               <w:rPr>
                 <w:sz w:val="16"/>
               </w:rPr>
-              <w:t>18000 – 51250 €</w:t>
+              <w:t>18000 – 53750 €</w:t>
             </w:r>
           </w:p>
         </w:tc>
@@ -8441,7 +8441,7 @@
               <w:rPr>
                 <w:sz w:val="16"/>
               </w:rPr>
-              <w:t>10</w:t>
+              <w:t>15</w:t>
             </w:r>
           </w:p>
         </w:tc>
@@ -8455,7 +8455,7 @@
               <w:rPr>
                 <w:sz w:val="16"/>
               </w:rPr>
-              <w:t>42750 €</w:t>
+              <w:t>43000 €</w:t>
             </w:r>
           </w:p>
         </w:tc>
@@ -8469,7 +8469,7 @@
               <w:rPr>
                 <w:sz w:val="16"/>
               </w:rPr>
-              <w:t>42375 €</w:t>
+              <w:t>42500 €</w:t>
             </w:r>
           </w:p>
         </w:tc>
@@ -8483,7 +8483,7 @@
               <w:rPr>
                 <w:sz w:val="16"/>
               </w:rPr>
-              <w:t>47500 €</w:t>
+              <w:t>44500 €</w:t>
             </w:r>
           </w:p>
         </w:tc>
@@ -8527,7 +8527,7 @@
               <w:rPr>
                 <w:sz w:val="16"/>
               </w:rPr>
-              <w:t>14</w:t>
+              <w:t>15</w:t>
             </w:r>
           </w:p>
         </w:tc>
@@ -8541,7 +8541,7 @@
               <w:rPr>
                 <w:sz w:val="16"/>
               </w:rPr>
-              <w:t>48000 €</w:t>
+              <w:t>48500 €</w:t>
             </w:r>
           </w:p>
         </w:tc>
@@ -8555,7 +8555,7 @@
               <w:rPr>
                 <w:sz w:val="16"/>
               </w:rPr>
-              <w:t>44000 €</w:t>
+              <w:t>45000 €</w:t>
             </w:r>
           </w:p>
         </w:tc>
@@ -8569,7 +8569,7 @@
               <w:rPr>
                 <w:sz w:val="16"/>
               </w:rPr>
-              <w:t>52250 €</w:t>
+              <w:t>53000 €</w:t>
             </w:r>
           </w:p>
         </w:tc>
@@ -8583,7 +8583,7 @@
               <w:rPr>
                 <w:sz w:val="16"/>
               </w:rPr>
-              <w:t>36200 – 65000 €</w:t>
+              <w:t>36200 – 75000 €</w:t>
             </w:r>
           </w:p>
         </w:tc>
@@ -8613,7 +8613,7 @@
               <w:rPr>
                 <w:sz w:val="16"/>
               </w:rPr>
-              <w:t>5</w:t>
+              <w:t>9</w:t>
             </w:r>
           </w:p>
         </w:tc>
@@ -8641,7 +8641,7 @@
               <w:rPr>
                 <w:sz w:val="16"/>
               </w:rPr>
-              <w:t>41250 €</w:t>
+              <w:t>43425 €</w:t>
             </w:r>
           </w:p>
         </w:tc>
@@ -8655,7 +8655,7 @@
               <w:rPr>
                 <w:sz w:val="16"/>
               </w:rPr>
-              <w:t>58000 €</w:t>
+              <w:t>51750 €</w:t>
             </w:r>
           </w:p>
         </w:tc>
@@ -8771,7 +8771,7 @@
               <w:rPr>
                 <w:sz w:val="16"/>
               </w:rPr>
-              <w:t>Développeur mobile</w:t>
+              <w:t>Développeur PHP / Symfony / Laravel</w:t>
             </w:r>
           </w:p>
         </w:tc>
@@ -8785,7 +8785,7 @@
               <w:rPr>
                 <w:sz w:val="16"/>
               </w:rPr>
-              <w:t>16</w:t>
+              <w:t>15</w:t>
             </w:r>
           </w:p>
         </w:tc>
@@ -8799,7 +8799,7 @@
               <w:rPr>
                 <w:sz w:val="16"/>
               </w:rPr>
-              <w:t>42250 €</w:t>
+              <w:t>44000 €</w:t>
             </w:r>
           </w:p>
         </w:tc>
@@ -8813,7 +8813,7 @@
               <w:rPr>
                 <w:sz w:val="16"/>
               </w:rPr>
-              <w:t>37750 €</w:t>
+              <w:t>32416 €</w:t>
             </w:r>
           </w:p>
         </w:tc>
@@ -8827,7 +8827,7 @@
               <w:rPr>
                 <w:sz w:val="16"/>
               </w:rPr>
-              <w:t>43775 €</w:t>
+              <w:t>46850 €</w:t>
             </w:r>
           </w:p>
         </w:tc>
@@ -8841,7 +8841,7 @@
               <w:rPr>
                 <w:sz w:val="16"/>
               </w:rPr>
-              <w:t>22000 – 50000 €</w:t>
+              <w:t>16344 – 56500 €</w:t>
             </w:r>
           </w:p>
         </w:tc>
@@ -8857,7 +8857,7 @@
               <w:rPr>
                 <w:sz w:val="16"/>
               </w:rPr>
-              <w:t>Concepteur développeur d'applications / logiciel</w:t>
+              <w:t>Développeur mobile</w:t>
             </w:r>
           </w:p>
         </w:tc>
@@ -8871,7 +8871,7 @@
               <w:rPr>
                 <w:sz w:val="16"/>
               </w:rPr>
-              <w:t>10</w:t>
+              <w:t>17</w:t>
             </w:r>
           </w:p>
         </w:tc>
@@ -8885,7 +8885,7 @@
               <w:rPr>
                 <w:sz w:val="16"/>
               </w:rPr>
-              <w:t>38250 €</w:t>
+              <w:t>42500 €</w:t>
             </w:r>
           </w:p>
         </w:tc>
@@ -8899,7 +8899,7 @@
               <w:rPr>
                 <w:sz w:val="16"/>
               </w:rPr>
-              <w:t>33875 €</w:t>
+              <w:t>38000 €</w:t>
             </w:r>
           </w:p>
         </w:tc>
@@ -8913,7 +8913,7 @@
               <w:rPr>
                 <w:sz w:val="16"/>
               </w:rPr>
-              <w:t>45000 €</w:t>
+              <w:t>44400 €</w:t>
             </w:r>
           </w:p>
         </w:tc>
@@ -8927,7 +8927,7 @@
               <w:rPr>
                 <w:sz w:val="16"/>
               </w:rPr>
-              <w:t>25800 – 50700 €</w:t>
+              <w:t>22000 – 50000 €</w:t>
             </w:r>
           </w:p>
         </w:tc>
@@ -8943,7 +8943,7 @@
               <w:rPr>
                 <w:sz w:val="16"/>
               </w:rPr>
-              <w:t>Développeur PHP / Symfony / Laravel</w:t>
+              <w:t>Concepteur développeur d'applications / logiciel</w:t>
             </w:r>
           </w:p>
         </w:tc>
@@ -8971,7 +8971,7 @@
               <w:rPr>
                 <w:sz w:val="16"/>
               </w:rPr>
-              <w:t>41500 €</w:t>
+              <w:t>39500 €</w:t>
             </w:r>
           </w:p>
         </w:tc>
@@ -8985,7 +8985,7 @@
               <w:rPr>
                 <w:sz w:val="16"/>
               </w:rPr>
-              <w:t>32000 €</w:t>
+              <w:t>34500 €</w:t>
             </w:r>
           </w:p>
         </w:tc>
@@ -8999,7 +8999,7 @@
               <w:rPr>
                 <w:sz w:val="16"/>
               </w:rPr>
-              <w:t>46850 €</w:t>
+              <w:t>45000 €</w:t>
             </w:r>
           </w:p>
         </w:tc>
@@ -9013,7 +9013,7 @@
               <w:rPr>
                 <w:sz w:val="16"/>
               </w:rPr>
-              <w:t>16344 – 56500 €</w:t>
+              <w:t>25800 – 50700 €</w:t>
             </w:r>
           </w:p>
         </w:tc>
@@ -9129,7 +9129,7 @@
               <w:rPr>
                 <w:sz w:val="16"/>
               </w:rPr>
-              <w:t>10</w:t>
+              <w:t>12</w:t>
             </w:r>
           </w:p>
         </w:tc>
@@ -9143,7 +9143,7 @@
               <w:rPr>
                 <w:sz w:val="16"/>
               </w:rPr>
-              <w:t>46250 €</w:t>
+              <w:t>45000 €</w:t>
             </w:r>
           </w:p>
         </w:tc>
@@ -9157,7 +9157,7 @@
               <w:rPr>
                 <w:sz w:val="16"/>
               </w:rPr>
-              <w:t>43912 €</w:t>
+              <w:t>42538 €</w:t>
             </w:r>
           </w:p>
         </w:tc>
@@ -9171,7 +9171,7 @@
               <w:rPr>
                 <w:sz w:val="16"/>
               </w:rPr>
-              <w:t>53125 €</w:t>
+              <w:t>52500 €</w:t>
             </w:r>
           </w:p>
         </w:tc>
@@ -12575,7 +12575,7 @@
           <w:b w:val="0"/>
           <w:i w:val="0"/>
         </w:rPr>
-        <w:t>Fréquence dans les extraits des 2645 offres uniques (sous-estimation, les extraits ne reprennent pas toute l'annonce) : JavaScript (318, 12.0 %) ; Java (313, 11.8 %) ; React (233, 8.8 %) ; Angular (204, 7.7 %) ; PHP (184, 7.0 %) ; .NET (162, 6.1 %) ; IA générative / LLM (149, 5.6 %) ; DevOps (148, 5.6 %) ; Python (141, 5.3 %) ; Mobile (iOS/Android/Flutter/React Native) (130, 4.9 %) ; Node.js (128, 4.8 %) ; Vue.js (108, 4.1 %) ; Symfony (106, 4.0 %) ; C# (105, 4.0 %) ; Architecture (78, 2.9 %). Excel, onglet COMPETENCES_ET_IA, table T_COMPETENCES.</w:t>
+        <w:t>Fréquence dans les extraits des 2953 offres uniques (sous-estimation, les extraits ne reprennent pas toute l'annonce) : JavaScript (383, 13.0 %) ; Java (351, 11.9 %) ; React (273, 9.2 %) ; Angular (230, 7.8 %) ; PHP (210, 7.1 %) ; .NET (178, 6.0 %) ; IA générative / LLM (178, 6.0 %) ; DevOps (162, 5.5 %) ; Python (158, 5.4 %) ; Node.js (153, 5.2 %) ; Mobile (iOS/Android/Flutter/React Native) (137, 4.6 %) ; Vue.js (128, 4.3 %) ; Symfony (119, 4.0 %) ; C# (111, 3.8 %) ; Architecture (85, 2.9 %). Excel, onglet COMPETENCES_ET_IA, table T_COMPETENCES.</w:t>
       </w:r>
     </w:p>
     <w:tbl>
@@ -12685,7 +12685,7 @@
               <w:rPr>
                 <w:sz w:val="15"/>
               </w:rPr>
-              <w:t>JavaScript (318) ; Java (313) ; PHP (184) ; Python (141) ; C# (105) ; TypeScript (64)</w:t>
+              <w:t>JavaScript (383) ; Java (351) ; PHP (210) ; Python (158) ; C# (111) ; TypeScript (83)</w:t>
             </w:r>
           </w:p>
         </w:tc>
@@ -12743,7 +12743,7 @@
               <w:rPr>
                 <w:sz w:val="15"/>
               </w:rPr>
-              <w:t>React (233) ; Angular (204) ; Vue.js (108) ; Next.js (20) ; Nuxt (5)</w:t>
+              <w:t>React (273) ; Angular (230) ; Vue.js (128) ; Next.js (24) ; Nuxt (5)</w:t>
             </w:r>
           </w:p>
         </w:tc>
@@ -12801,7 +12801,7 @@
               <w:rPr>
                 <w:sz w:val="15"/>
               </w:rPr>
-              <w:t>.NET (162) ; Node.js (128) ; Symfony (106) ; Spring (43) ; Django (37) ; Laravel (26)</w:t>
+              <w:t>.NET (178) ; Node.js (153) ; Symfony (119) ; Spring (50) ; Django (40) ; Laravel (30)</w:t>
             </w:r>
           </w:p>
         </w:tc>
@@ -12859,7 +12859,7 @@
               <w:rPr>
                 <w:sz w:val="15"/>
               </w:rPr>
-              <w:t>MySQL/MariaDB (22) ; PostgreSQL (13) ; MongoDB (8) ; SQL Server (7) ; Elasticsearch (3)</w:t>
+              <w:t>MySQL/MariaDB (23) ; PostgreSQL (14) ; MongoDB (9) ; SQL Server (7) ; Elasticsearch (3)</w:t>
             </w:r>
           </w:p>
         </w:tc>
@@ -12917,7 +12917,7 @@
               <w:rPr>
                 <w:sz w:val="15"/>
               </w:rPr>
-              <w:t>API REST (48) ; Microservices (13) ; Kafka/RabbitMQ (3) ; GraphQL (3)</w:t>
+              <w:t>API REST (51) ; Microservices (15) ; Kafka/RabbitMQ (5) ; GraphQL (3)</w:t>
             </w:r>
           </w:p>
         </w:tc>
@@ -12975,7 +12975,7 @@
               <w:rPr>
                 <w:sz w:val="15"/>
               </w:rPr>
-              <w:t>Cloud (générique) (76) ; AWS (38) ; GCP (25) ; Azure (25) ; OVH/Scaleway (6)</w:t>
+              <w:t>Cloud (générique) (81) ; AWS (39) ; GCP (26) ; Azure (26) ; OVH/Scaleway (10)</w:t>
             </w:r>
           </w:p>
         </w:tc>
@@ -13033,7 +13033,7 @@
               <w:rPr>
                 <w:sz w:val="15"/>
               </w:rPr>
-              <w:t>DevOps (148) ; CI/CD (26) ; Docker (22) ; Kubernetes (20) ; Git (12) ; Terraform (11)</w:t>
+              <w:t>DevOps (162) ; CI/CD (28) ; Docker (27) ; Kubernetes (27) ; Git (13) ; Terraform (13)</w:t>
             </w:r>
           </w:p>
         </w:tc>
@@ -13091,7 +13091,7 @@
               <w:rPr>
                 <w:sz w:val="15"/>
               </w:rPr>
-              <w:t>Tests automatisés / E2E (18) ; Tests unitaires (16) ; Qualité de code (4) ; TDD/BDD (2)</w:t>
+              <w:t>Tests unitaires (18) ; Tests automatisés / E2E (18) ; Qualité de code (5) ; TDD/BDD (2)</w:t>
             </w:r>
           </w:p>
         </w:tc>
@@ -13149,7 +13149,7 @@
               <w:rPr>
                 <w:sz w:val="15"/>
               </w:rPr>
-              <w:t>Sécurité applicative (65) ; Authentification (21)</w:t>
+              <w:t>Sécurité applicative (67) ; Authentification (22)</w:t>
             </w:r>
           </w:p>
         </w:tc>
@@ -13207,7 +13207,7 @@
               <w:rPr>
                 <w:sz w:val="15"/>
               </w:rPr>
-              <w:t>Architecture (78)</w:t>
+              <w:t>Architecture (85)</w:t>
             </w:r>
           </w:p>
         </w:tc>
@@ -13265,7 +13265,7 @@
               <w:rPr>
                 <w:sz w:val="15"/>
               </w:rPr>
-              <w:t>Agile/Scrum (29) ; Jira (6)</w:t>
+              <w:t>Agile/Scrum (32) ; Jira (6)</w:t>
             </w:r>
           </w:p>
         </w:tc>
@@ -13323,7 +13323,7 @@
               <w:rPr>
                 <w:sz w:val="15"/>
               </w:rPr>
-              <w:t>Anglais (8)</w:t>
+              <w:t>Anglais (9)</w:t>
             </w:r>
           </w:p>
         </w:tc>
@@ -13431,7 +13431,7 @@
         <w:pStyle w:val="ListBullet"/>
       </w:pPr>
       <w:r>
-        <w:t>Échantillon collecté : 310 offres uniques (11.7 %) mentionnent explicitement l'IA ; parmi les offres de développeur web/full stack/logiciel « classiques » (hors métiers IA), 66 sur 2066 (3.2 %) citent l'IA ; outils de codage IA cités : GitHub Copilot (18) ; Cursor (10) ; ChatGPT (6) ; Claude Code (5) ; Développement assisté par IA (4) ; Codex (2). Stocks Indeed : « Développeur Intelligence Artificielle » plus de 600 (05/09/2026), « Développeur LLM » plus de 200 (04/09/2026), « Claude Code » plus de 200 (21/08/2026), « Full Stack JS Intelligence Artificielle » plus de 100 (02/09/2026). Excel, COMPETENCES_ET_IA, table T_DEV_AUGMENTE.</w:t>
+        <w:t>Échantillon collecté : 362 offres uniques (12.3 %) mentionnent explicitement l'IA ; parmi les offres de développeur web/full stack/logiciel « classiques » (hors métiers IA), 78 sur 2318 (3.4 %) citent l'IA ; outils de codage IA cités : GitHub Copilot (18) ; Cursor (10) ; Claude Code (6) ; ChatGPT (6) ; Développement assisté par IA (5) ; Codex (2). Stocks Indeed : « Développeur Intelligence Artificielle » plus de 600 (05/09/2026), « Développeur LLM » plus de 200 (04/09/2026), « Claude Code » plus de 200 (21/08/2026), « Full Stack JS Intelligence Artificielle » plus de 100 (02/09/2026). Excel, COMPETENCES_ET_IA, table T_DEV_AUGMENTE.</w:t>
       </w:r>
     </w:p>
     <w:p>
@@ -13519,7 +13519,7 @@
           <w:b w:val="0"/>
           <w:i w:val="0"/>
         </w:rPr>
-        <w:t>Le terme « développeur augmenté » n'apparaît dans aucune offre collectée. En revanche trois signaux observables existent : (1) des offres de développeur web/full stack/logiciel « classiques » qui citent l'IA : 66 dans l'échantillon (3.2 % des offres cœur de marché et évolutions), dont 15 exigent ou mentionnent explicitement un assistant de code (Copilot, Cursor, Claude Code, ChatGPT, Codex, développement assisté par IA), par exemple Koala Interactive (Levallois-Perret : Cursor ; Claude Code) ; Groupe M6 (Neuilly-sur-Seine : GitHub Copilot ; Cursor ; ChatGPT) ; Theodo FinTech (Paris : GitHub Copilot ; Cursor) ; Bump (ville NC : GitHub Copilot ; Cursor) ; Figaro Classifieds (Paris : GitHub Copilot ; Cursor ; Claude Code) ; LinkedIn (ville NC : GitHub Copilot) ; Société Générale (France : GitHub Copilot) ; Mondial Frigo-Ifc (Saint-Priest : Développement assisté par IA) ; (2) une famille de métiers émergents (AI Engineer, AI Software Engineer, LLM/GenAI Engineer, développeur RAG/agents) qui représente 254 offres uniques, presque toutes à Paris et pour des profils expérimentés ; (3) le chiffre Indeed de 21 % d'annonces de développement logiciel mentionnant l'IA, qui inclut aussi bien l'usage d'outils que le développement de fonctionnalités IA.</w:t>
+        <w:t>Le terme « développeur augmenté » n'apparaît dans aucune offre collectée. En revanche trois signaux observables existent : (1) des offres de développeur web/full stack/logiciel « classiques » qui citent l'IA : 78 dans l'échantillon (3.4 % des offres cœur de marché et évolutions), dont 14 exigent ou mentionnent explicitement un assistant de code (Copilot, Cursor, Claude Code, ChatGPT, Codex, développement assisté par IA), par exemple Koala Interactive (Levallois-Perret : Cursor ; Claude Code) ; Groupe M6 (Neuilly-sur-Seine : GitHub Copilot ; Cursor ; ChatGPT) ; Theodo FinTech (Paris : GitHub Copilot ; Cursor) ; Bump (ville NC : GitHub Copilot ; Cursor) ; Figaro Classifieds (Paris : GitHub Copilot ; Cursor ; Claude Code) ; LinkedIn (ville NC : GitHub Copilot) ; Société Générale (France : GitHub Copilot) ; Mondial Frigo-Ifc (Saint-Priest : Développement assisté par IA) ; (2) une famille de métiers émergents (AI Engineer, AI Software Engineer, LLM/GenAI Engineer, développeur RAG/agents) qui représente 290 offres uniques, presque toutes à Paris et pour des profils expérimentés ; (3) le chiffre Indeed de 21 % d'annonces de développement logiciel mentionnant l'IA, qui inclut aussi bien l'usage d'outils que le développement de fonctionnalités IA.</w:t>
       </w:r>
     </w:p>
     <w:p>
@@ -13649,7 +13649,7 @@
               <w:rPr>
                 <w:sz w:val="16"/>
               </w:rPr>
-              <w:t>Oui : 24.5 % des offres uniques de l'échantillon portent l'intitulé full stack, contre 5.8 % « développeur web » ; le stock Indeed full stack progresse quand celui de « développeur web » recule.</w:t>
+              <w:t>Oui : 25.7 % des offres uniques de l'échantillon portent l'intitulé full stack, contre 5.4 % « développeur web » ; le stock Indeed full stack progresse quand celui de « développeur web » recule.</w:t>
             </w:r>
           </w:p>
         </w:tc>
@@ -14326,7 +14326,7 @@
               <w:rPr>
                 <w:sz w:val="15"/>
               </w:rPr>
-              <w:t>Stable à croissant : full stack premier intitulé (24.5 % de l'échantillon), stock Indeed en hausse</w:t>
+              <w:t>Stable à croissant : full stack premier intitulé (25.7 % de l'échantillon), stock Indeed en hausse</w:t>
             </w:r>
           </w:p>
         </w:tc>
@@ -15043,7 +15043,7 @@
               <w:rPr>
                 <w:sz w:val="14"/>
               </w:rPr>
-              <w:t>Full stack = 24.5 % de l'échantillon ; Indeed « Développeur Full Stack » plus de 500 (08/2025) → plus de 800 (09/2026) ; Apec data engineer +10 % ; BMO numérique 49,5 % de projets difficiles ; cabinets : hausses réservées à cloud/cyber/data/IA.</w:t>
+              <w:t>Full stack = 25.7 % de l'échantillon ; Indeed « Développeur Full Stack » plus de 500 (08/2025) → plus de 800 (09/2026) ; Apec data engineer +10 % ; BMO numérique 49,5 % de projets difficiles ; cabinets : hausses réservées à cloud/cyber/data/IA.</w:t>
             </w:r>
           </w:p>
         </w:tc>
@@ -15143,7 +15143,7 @@
               <w:rPr>
                 <w:sz w:val="14"/>
               </w:rPr>
-              <w:t>Apec débutants -19 % (2024), -16 % (2025) ; Numeum 33 % des ESN réduisent les jeunes diplômés ; échantillon : seniors + leads = 42.1 % des offres à séniorité renseignée, 83 offres débutant/junior en CDI.</w:t>
+              <w:t>Apec débutants -19 % (2024), -16 % (2025) ; Numeum 33 % des ESN réduisent les jeunes diplômés ; échantillon : seniors + leads = 41.1 % des offres à séniorité renseignée, 93 offres débutant/junior en CDI.</w:t>
             </w:r>
           </w:p>
         </w:tc>
@@ -15243,7 +15243,7 @@
               <w:rPr>
                 <w:sz w:val="14"/>
               </w:rPr>
-              <w:t>Dans l'échantillon, 87.8 % des offres DEBUTANT sont des stages/alternances ; Indeed « Stage Développeur Web » IDF plus de 800 (01/2025) ; secteurs : ESN, agences, e-commerce, médias.</w:t>
+              <w:t>Dans l'échantillon, 88.4 % des offres DEBUTANT sont des stages/alternances ; Indeed « Stage Développeur Web » IDF plus de 800 (01/2025) ; secteurs : ESN, agences, e-commerce, médias.</w:t>
             </w:r>
           </w:p>
         </w:tc>
@@ -15543,7 +15543,7 @@
               <w:rPr>
                 <w:sz w:val="14"/>
               </w:rPr>
-              <w:t>66 offres cœur de marché (3.2 %) citent un outil ou une compétence IA ; Indeed : 21 % des annonces de développement logiciel mentionnent l'IA ; stocks « Claude Code » plus de 200, « Full Stack JS IA » plus de 100.</w:t>
+              <w:t>78 offres cœur de marché (3.4 %) citent un outil ou une compétence IA ; Indeed : 21 % des annonces de développement logiciel mentionnent l'IA ; stocks « Claude Code » plus de 200, « Full Stack JS IA » plus de 100.</w:t>
             </w:r>
           </w:p>
         </w:tc>
@@ -15643,7 +15643,7 @@
               <w:rPr>
                 <w:sz w:val="14"/>
               </w:rPr>
-              <w:t>« Développeur web » = 5.8 % de l'échantillon contre 24.5 % full stack ; Indeed « Ingénieur Logiciel » plus de 4 000, « Développeur » plus de 3 000, « Software Engineer » plus de 1 000 ; HelloWork « Développeur informatique » plus de 9 650.</w:t>
+              <w:t>« Développeur web » = 5.4 % de l'échantillon contre 25.7 % full stack ; Indeed « Ingénieur Logiciel » plus de 4 000, « Développeur » plus de 3 000, « Software Engineer » plus de 1 000 ; HelloWork « Développeur informatique » plus de 9 650.</w:t>
             </w:r>
           </w:p>
         </w:tc>
@@ -15743,7 +15743,7 @@
               <w:rPr>
                 <w:sz w:val="14"/>
               </w:rPr>
-              <w:t>Seniors + leads = 42.1 % des offres renseignées ; spécialisations et métiers IA quasi exclusivement seniors ; Apec : profils 5-10 ans très recherchés ; Bac+5 informatique en recul d'insertion mais toujours 70 % en emploi à 12 mois.</w:t>
+              <w:t>Seniors + leads = 41.1 % des offres renseignées ; spécialisations et métiers IA quasi exclusivement seniors ; Apec : profils 5-10 ans très recherchés ; Bac+5 informatique en recul d'insertion mais toujours 70 % en emploi à 12 mois.</w:t>
             </w:r>
           </w:p>
         </w:tc>
@@ -15843,7 +15843,7 @@
               <w:rPr>
                 <w:sz w:val="14"/>
               </w:rPr>
-              <w:t>Paris = 29 % des offres Apec et 28.9 % de l'échantillon, ville qui concentre l'essentiel des offres IA (56.3 % des offres IA de l'échantillon) ; Lyon 300-400 offres « développeur » actives, Marseille ≈ 100 ; Lille/Nantes alternance et e-commerce ; Apec prévisions régionales +2 à +6 %.</w:t>
+              <w:t>Paris = 29 % des offres Apec et 29.6 % de l'échantillon, ville qui concentre l'essentiel des offres IA (56.2 % des offres IA de l'échantillon) ; Lyon 300-400 offres « développeur » actives, Marseille ≈ 100 ; Lille/Nantes alternance et e-commerce ; Apec prévisions régionales +2 à +6 %.</w:t>
             </w:r>
           </w:p>
         </w:tc>

</xml_diff>

<commit_message>
Word : repères de villes calculés sur l'échantillon, corrections Nantes et H10
Les affirmations comparatives entre campus (alternance, séniorité, IA) sont désormais dérivées des données plutôt que rédigées : Nantes est le campus où l'alternance pèse le moins et la séniorité le plus, Marseille-Aix l'inverse.

Co-Authored-By: Claude Opus 5 <noreply@anthropic.com>
Claude-Session: https://claude.ai/code/session_01XMur3EjWoJPqS7QuAJkjnZ
</commit_message>
<xml_diff>
--- a/NEXA_Synthese_Marche_Emploi_Developpement_Web_2026.docx
+++ b/NEXA_Synthese_Marche_Emploi_Developpement_Web_2026.docx
@@ -5459,7 +5459,7 @@
         <w:pStyle w:val="ListBullet"/>
       </w:pPr>
       <w:r>
-        <w:t>Nantes et métropole : Bassin ESN et éditeurs (Sopra Steria, Aubay, Edflex, Yuzu) : Indeed « Développeur » plus de 200 (oct. 2025), forte présence de postes de tech lead et DevOps (ESN) ; alternance bien représentée (WTTJ). Apec signale des tensions spécifiques informatique en Pays de la Loire.</w:t>
+        <w:t>Nantes et métropole : Bassin ESN et éditeurs (Sopra Steria, Aubay, Edflex, Yuzu) : Indeed « Développeur » plus de 200 (oct. 2025), forte présence de postes de tech lead et DevOps (ESN) ; c'est en revanche la ville NEXA où l'alternance et le stage pèsent le moins dans l'échantillon et où la part de seniors et de leads est la plus élevée des six campus. Apec signale des tensions spécifiques informatique en Pays de la Loire.</w:t>
       </w:r>
     </w:p>
     <w:p>
@@ -5467,7 +5467,7 @@
         <w:pStyle w:val="ListBullet"/>
       </w:pPr>
       <w:r>
-        <w:t>Marseille et Aix-en-Provence : Bassin le plus petit des six : Indeed « Développeur » environ 100 offres actives (mars-août 2026), « Développeur Web » plus de 75 (sept. 2026), « Développeur Alternance » plus de 75 (avril 2026) ; très peu de mentions IA ; part d'alternance et de stages la plus élevée de l'échantillon. Le télétravail et le marché national à distance comptent davantage ici.</w:t>
+        <w:t>Marseille et Aix-en-Provence : Bassin le plus petit des six : Indeed « Développeur » environ 100 offres actives (mars-août 2026), « Développeur Web » plus de 75 (sept. 2026), « Développeur Alternance » plus de 75 (avril 2026) ; très peu de mentions IA ; c'est le campus où l'alternance et le stage pèsent le plus lourd et où la part de débutants et juniors est la plus élevée (voir le tableau ci-dessus). Le télétravail et le marché national à distance comptent davantage ici.</w:t>
       </w:r>
     </w:p>
     <w:p>
@@ -5481,10 +5481,19 @@
     <w:p>
       <w:r>
         <w:rPr>
+          <w:b w:val="0"/>
+          <w:i/>
+        </w:rPr>
+        <w:t>Repères calculés sur l'échantillon (ils priment sur les lectures qualitatives ci-dessus). Parmi les six campus : l'alternance et le stage pèsent le plus à Marseille et Aix-en-Provence (35.2 % des contrats renseignés) et le moins à Nantes et métropole (14.8 %) ; la part de seniors et de leads est la plus forte à Nantes et métropole (48.2 % des séniorités renseignées) ; la mention explicite de l'IA est la plus fréquente à Paris et Île-de-France (20.6 % des offres de la zone). Le marché national à distance se distingue des six campus : 7.1 % d'alternance et de stage seulement, 66.7 % de seniors et de leads. Excel, onglet VILLES_NEXA, table T_COMPARATIF_VILLES.</w:t>
+      </w:r>
+    </w:p>
+    <w:p>
+      <w:r>
+        <w:rPr>
           <w:b/>
           <w:i w:val="0"/>
         </w:rPr>
-        <w:t>Réponse à la question 12 (adaptations par campus) : socle commun identique sur les six campus, mais accent alternance et e-commerce/retail à Lille et Nantes, industrialisation et ESN à Lyon, IA appliquée et scale-ups à Paris, préparation au marché à distance et à la mobilité à Marseille-Aix et Bordeaux, où le volume local reste limité. Confiance MOYENNE (échantillon de 63 à 875 offres par ville).</w:t>
+        <w:t>Réponse à la question 12 (adaptations par campus) : socle commun identique sur les six campus, mais accent e-commerce/retail et alternance à Lille, ESN et postes expérimentés à Nantes, industrialisation et ESN à Lyon, IA appliquée et scale-ups à Paris, préparation au marché à distance et à la mobilité à Marseille-Aix et Bordeaux, où le volume local reste limité. Confiance MOYENNE (échantillon de 63 à 875 offres par ville).</w:t>
       </w:r>
     </w:p>
     <w:p>
@@ -15843,7 +15852,7 @@
               <w:rPr>
                 <w:sz w:val="14"/>
               </w:rPr>
-              <w:t>Paris = 29 % des offres Apec et 29.6 % de l'échantillon, ville qui concentre l'essentiel des offres IA (56.2 % des offres IA de l'échantillon) ; Lyon 300-400 offres « développeur » actives, Marseille ≈ 100 ; Lille/Nantes alternance et e-commerce ; Apec prévisions régionales +2 à +6 %.</w:t>
+              <w:t>Paris = 29 % des offres Apec et 29.6 % de l'échantillon, ville qui concentre l'essentiel des offres IA (56.2 % des offres IA de l'échantillon) ; Lyon 300-400 offres « développeur » actives, Marseille ≈ 100 ; Lille alternance et e-commerce, Nantes orientée ESN et profils expérimentés ; Apec prévisions régionales +2 à +6 %.</w:t>
             </w:r>
           </w:p>
         </w:tc>

</xml_diff>